<commit_message>
feat: field Keterangan BA Lainnya, format BA-NNN, tukar menu Rejected/Archive Reviewer, update template docx
</commit_message>
<xml_diff>
--- a/SistemBeritaAcara.Web/wwwroot/files/templates/Template_BA_ALOKASI.docx
+++ b/SistemBeritaAcara.Web/wwwroot/files/templates/Template_BA_ALOKASI.docx
@@ -4,7 +4,7 @@
   <w:body>
     <w:tbl>
       <w:tblPr>
-        <w:tblStyle w:val="KisiTabel"/>
+        <w:tblStyle w:val="TableGrid"/>
         <w:tblW w:w="0" w:type="auto"/>
         <w:tblBorders>
           <w:top w:val="none" w:sz="0" w:space="0" w:color="auto"/>
@@ -166,7 +166,15 @@
               <w:jc w:val="center"/>
             </w:pPr>
             <w:r>
-              <w:t xml:space="preserve">Jl. Jenderal Ahmad Yani </w:t>
+              <w:t xml:space="preserve">Jl. </w:t>
+            </w:r>
+            <w:proofErr w:type="spellStart"/>
+            <w:r>
+              <w:t>Jenderal</w:t>
+            </w:r>
+            <w:proofErr w:type="spellEnd"/>
+            <w:r>
+              <w:t xml:space="preserve"> Ahmad Yani </w:t>
             </w:r>
           </w:p>
           <w:p>
@@ -228,7 +236,7 @@
           </w:tcPr>
           <w:tbl>
             <w:tblPr>
-              <w:tblStyle w:val="KisiTabel"/>
+              <w:tblStyle w:val="TableGrid"/>
               <w:tblW w:w="0" w:type="auto"/>
               <w:tblBorders>
                 <w:insideV w:val="none" w:sz="0" w:space="0" w:color="auto"/>
@@ -576,7 +584,23 @@
                 <w:sz w:val="18"/>
                 <w:szCs w:val="18"/>
               </w:rPr>
-              <w:t>Nama Penanggung Jawab</w:t>
+              <w:t xml:space="preserve">Nama </w:t>
+            </w:r>
+            <w:proofErr w:type="spellStart"/>
+            <w:r>
+              <w:rPr>
+                <w:sz w:val="18"/>
+                <w:szCs w:val="18"/>
+              </w:rPr>
+              <w:t>Penanggung</w:t>
+            </w:r>
+            <w:proofErr w:type="spellEnd"/>
+            <w:r>
+              <w:rPr>
+                <w:sz w:val="18"/>
+                <w:szCs w:val="18"/>
+              </w:rPr>
+              <w:t xml:space="preserve"> Jawab</w:t>
             </w:r>
           </w:p>
         </w:tc>
@@ -629,7 +653,23 @@
                 <w:sz w:val="18"/>
                 <w:szCs w:val="18"/>
               </w:rPr>
-              <w:t>{{NamaPJ}}</w:t>
+              <w:t>{{</w:t>
+            </w:r>
+            <w:proofErr w:type="spellStart"/>
+            <w:r>
+              <w:rPr>
+                <w:sz w:val="18"/>
+                <w:szCs w:val="18"/>
+              </w:rPr>
+              <w:t>NamaPJ</w:t>
+            </w:r>
+            <w:proofErr w:type="spellEnd"/>
+            <w:r>
+              <w:rPr>
+                <w:sz w:val="18"/>
+                <w:szCs w:val="18"/>
+              </w:rPr>
+              <w:t>}}</w:t>
             </w:r>
           </w:p>
         </w:tc>
@@ -711,7 +751,23 @@
                 <w:sz w:val="18"/>
                 <w:szCs w:val="18"/>
               </w:rPr>
-              <w:t>{{CostCenter}}</w:t>
+              <w:t>{{</w:t>
+            </w:r>
+            <w:proofErr w:type="spellStart"/>
+            <w:r>
+              <w:rPr>
+                <w:sz w:val="18"/>
+                <w:szCs w:val="18"/>
+              </w:rPr>
+              <w:t>CostCenter</w:t>
+            </w:r>
+            <w:proofErr w:type="spellEnd"/>
+            <w:r>
+              <w:rPr>
+                <w:sz w:val="18"/>
+                <w:szCs w:val="18"/>
+              </w:rPr>
+              <w:t>}}</w:t>
             </w:r>
           </w:p>
         </w:tc>
@@ -735,6 +791,7 @@
                 <w:szCs w:val="18"/>
               </w:rPr>
             </w:pPr>
+            <w:proofErr w:type="spellStart"/>
             <w:r>
               <w:rPr>
                 <w:sz w:val="18"/>
@@ -742,6 +799,7 @@
               </w:rPr>
               <w:t>Jabatan</w:t>
             </w:r>
+            <w:proofErr w:type="spellEnd"/>
           </w:p>
         </w:tc>
         <w:tc>
@@ -793,7 +851,23 @@
                 <w:sz w:val="18"/>
                 <w:szCs w:val="18"/>
               </w:rPr>
-              <w:t>{{JabatanPJ}}</w:t>
+              <w:t>{{</w:t>
+            </w:r>
+            <w:proofErr w:type="spellStart"/>
+            <w:r>
+              <w:rPr>
+                <w:sz w:val="18"/>
+                <w:szCs w:val="18"/>
+              </w:rPr>
+              <w:t>JabatanPJ</w:t>
+            </w:r>
+            <w:proofErr w:type="spellEnd"/>
+            <w:r>
+              <w:rPr>
+                <w:sz w:val="18"/>
+                <w:szCs w:val="18"/>
+              </w:rPr>
+              <w:t>}}</w:t>
             </w:r>
           </w:p>
         </w:tc>
@@ -817,13 +891,31 @@
                 <w:szCs w:val="18"/>
               </w:rPr>
             </w:pPr>
-            <w:r>
-              <w:rPr>
-                <w:sz w:val="18"/>
-                <w:szCs w:val="18"/>
-              </w:rPr>
-              <w:t>Fungsi/Direktorat</w:t>
-            </w:r>
+            <w:proofErr w:type="spellStart"/>
+            <w:r>
+              <w:rPr>
+                <w:sz w:val="18"/>
+                <w:szCs w:val="18"/>
+              </w:rPr>
+              <w:t>Fungsi</w:t>
+            </w:r>
+            <w:proofErr w:type="spellEnd"/>
+            <w:r>
+              <w:rPr>
+                <w:sz w:val="18"/>
+                <w:szCs w:val="18"/>
+              </w:rPr>
+              <w:t>/</w:t>
+            </w:r>
+            <w:proofErr w:type="spellStart"/>
+            <w:r>
+              <w:rPr>
+                <w:sz w:val="18"/>
+                <w:szCs w:val="18"/>
+              </w:rPr>
+              <w:t>Direktorat</w:t>
+            </w:r>
+            <w:proofErr w:type="spellEnd"/>
           </w:p>
         </w:tc>
         <w:tc>
@@ -875,7 +967,23 @@
                 <w:sz w:val="18"/>
                 <w:szCs w:val="18"/>
               </w:rPr>
-              <w:t>{{FungsiPJ}}</w:t>
+              <w:t>{{</w:t>
+            </w:r>
+            <w:proofErr w:type="spellStart"/>
+            <w:r>
+              <w:rPr>
+                <w:sz w:val="18"/>
+                <w:szCs w:val="18"/>
+              </w:rPr>
+              <w:t>FungsiPJ</w:t>
+            </w:r>
+            <w:proofErr w:type="spellEnd"/>
+            <w:r>
+              <w:rPr>
+                <w:sz w:val="18"/>
+                <w:szCs w:val="18"/>
+              </w:rPr>
+              <w:t>}}</w:t>
             </w:r>
           </w:p>
         </w:tc>
@@ -957,7 +1065,23 @@
                 <w:sz w:val="18"/>
                 <w:szCs w:val="18"/>
               </w:rPr>
-              <w:t>{{FungsiPJ}}</w:t>
+              <w:t>{{</w:t>
+            </w:r>
+            <w:proofErr w:type="spellStart"/>
+            <w:r>
+              <w:rPr>
+                <w:sz w:val="18"/>
+                <w:szCs w:val="18"/>
+              </w:rPr>
+              <w:t>FungsiPJ</w:t>
+            </w:r>
+            <w:proofErr w:type="spellEnd"/>
+            <w:r>
+              <w:rPr>
+                <w:sz w:val="18"/>
+                <w:szCs w:val="18"/>
+              </w:rPr>
+              <w:t>}}</w:t>
             </w:r>
           </w:p>
         </w:tc>
@@ -1039,7 +1163,23 @@
                 <w:sz w:val="18"/>
                 <w:szCs w:val="18"/>
               </w:rPr>
-              <w:t>{{EmailPJ}}</w:t>
+              <w:t>{{</w:t>
+            </w:r>
+            <w:proofErr w:type="spellStart"/>
+            <w:r>
+              <w:rPr>
+                <w:sz w:val="18"/>
+                <w:szCs w:val="18"/>
+              </w:rPr>
+              <w:t>EmailPJ</w:t>
+            </w:r>
+            <w:proofErr w:type="spellEnd"/>
+            <w:r>
+              <w:rPr>
+                <w:sz w:val="18"/>
+                <w:szCs w:val="18"/>
+              </w:rPr>
+              <w:t>}}</w:t>
             </w:r>
           </w:p>
         </w:tc>
@@ -1068,8 +1208,17 @@
                 <w:sz w:val="18"/>
                 <w:szCs w:val="18"/>
               </w:rPr>
-              <w:t>No. Pekerja</w:t>
-            </w:r>
+              <w:t xml:space="preserve">No. </w:t>
+            </w:r>
+            <w:proofErr w:type="spellStart"/>
+            <w:r>
+              <w:rPr>
+                <w:sz w:val="18"/>
+                <w:szCs w:val="18"/>
+              </w:rPr>
+              <w:t>Pekerja</w:t>
+            </w:r>
+            <w:proofErr w:type="spellEnd"/>
           </w:p>
         </w:tc>
         <w:tc>
@@ -1121,7 +1270,23 @@
                 <w:sz w:val="18"/>
                 <w:szCs w:val="18"/>
               </w:rPr>
-              <w:t>{{NoPekerjaPJ}}</w:t>
+              <w:t>{{</w:t>
+            </w:r>
+            <w:proofErr w:type="spellStart"/>
+            <w:r>
+              <w:rPr>
+                <w:sz w:val="18"/>
+                <w:szCs w:val="18"/>
+              </w:rPr>
+              <w:t>NoPekerjaPJ</w:t>
+            </w:r>
+            <w:proofErr w:type="spellEnd"/>
+            <w:r>
+              <w:rPr>
+                <w:sz w:val="18"/>
+                <w:szCs w:val="18"/>
+              </w:rPr>
+              <w:t>}}</w:t>
             </w:r>
           </w:p>
         </w:tc>
@@ -1203,7 +1368,23 @@
                 <w:sz w:val="18"/>
                 <w:szCs w:val="18"/>
               </w:rPr>
-              <w:t>{{NoTelpPJ}}</w:t>
+              <w:t>{{</w:t>
+            </w:r>
+            <w:proofErr w:type="spellStart"/>
+            <w:r>
+              <w:rPr>
+                <w:sz w:val="18"/>
+                <w:szCs w:val="18"/>
+              </w:rPr>
+              <w:t>NoTelpPJ</w:t>
+            </w:r>
+            <w:proofErr w:type="spellEnd"/>
+            <w:r>
+              <w:rPr>
+                <w:sz w:val="18"/>
+                <w:szCs w:val="18"/>
+              </w:rPr>
+              <w:t>}}</w:t>
             </w:r>
           </w:p>
         </w:tc>
@@ -1233,8 +1414,9 @@
           <w:sz w:val="18"/>
           <w:szCs w:val="18"/>
         </w:rPr>
-        <w:t xml:space="preserve">Pada hari ini </w:t>
-      </w:r>
+        <w:t xml:space="preserve">Pada </w:t>
+      </w:r>
+      <w:proofErr w:type="spellStart"/>
       <w:r>
         <w:rPr>
           <w:b/>
@@ -1242,8 +1424,9 @@
           <w:sz w:val="18"/>
           <w:szCs w:val="18"/>
         </w:rPr>
-        <w:t>{{HariTanggal}}</w:t>
-      </w:r>
+        <w:t>hari</w:t>
+      </w:r>
+      <w:proofErr w:type="spellEnd"/>
       <w:r>
         <w:rPr>
           <w:b/>
@@ -1251,8 +1434,9 @@
           <w:sz w:val="18"/>
           <w:szCs w:val="18"/>
         </w:rPr>
-        <w:t xml:space="preserve"> Tanggal </w:t>
-      </w:r>
+        <w:t xml:space="preserve"> </w:t>
+      </w:r>
+      <w:proofErr w:type="spellStart"/>
       <w:r>
         <w:rPr>
           <w:b/>
@@ -1260,8 +1444,9 @@
           <w:sz w:val="18"/>
           <w:szCs w:val="18"/>
         </w:rPr>
-        <w:t>{{TanggalAngka}}</w:t>
-      </w:r>
+        <w:t>ini</w:t>
+      </w:r>
+      <w:proofErr w:type="spellEnd"/>
       <w:r>
         <w:rPr>
           <w:b/>
@@ -1278,8 +1463,9 @@
           <w:sz w:val="18"/>
           <w:szCs w:val="18"/>
         </w:rPr>
-        <w:t>{{BulanTanggal}}</w:t>
-      </w:r>
+        <w:t>{{</w:t>
+      </w:r>
+      <w:proofErr w:type="spellStart"/>
       <w:r>
         <w:rPr>
           <w:b/>
@@ -1287,7 +1473,342 @@
           <w:sz w:val="18"/>
           <w:szCs w:val="18"/>
         </w:rPr>
-        <w:t xml:space="preserve"> {{TahunTanggal}} telah diserahterimakan perangkat dengan spesifikasi serta syarat-syarat dan ketentuan sebagai berikut:</w:t>
+        <w:t>HariTanggal</w:t>
+      </w:r>
+      <w:proofErr w:type="spellEnd"/>
+      <w:r>
+        <w:rPr>
+          <w:b/>
+          <w:bCs/>
+          <w:sz w:val="18"/>
+          <w:szCs w:val="18"/>
+        </w:rPr>
+        <w:t>}}</w:t>
+      </w:r>
+      <w:r>
+        <w:rPr>
+          <w:b/>
+          <w:bCs/>
+          <w:sz w:val="18"/>
+          <w:szCs w:val="18"/>
+        </w:rPr>
+        <w:t xml:space="preserve"> </w:t>
+      </w:r>
+      <w:proofErr w:type="spellStart"/>
+      <w:r>
+        <w:rPr>
+          <w:b/>
+          <w:bCs/>
+          <w:sz w:val="18"/>
+          <w:szCs w:val="18"/>
+        </w:rPr>
+        <w:t>Tanggal</w:t>
+      </w:r>
+      <w:proofErr w:type="spellEnd"/>
+      <w:r>
+        <w:rPr>
+          <w:b/>
+          <w:bCs/>
+          <w:sz w:val="18"/>
+          <w:szCs w:val="18"/>
+        </w:rPr>
+        <w:t xml:space="preserve"> </w:t>
+      </w:r>
+      <w:r>
+        <w:rPr>
+          <w:b/>
+          <w:bCs/>
+          <w:sz w:val="18"/>
+          <w:szCs w:val="18"/>
+        </w:rPr>
+        <w:t>{{</w:t>
+      </w:r>
+      <w:proofErr w:type="spellStart"/>
+      <w:r>
+        <w:rPr>
+          <w:b/>
+          <w:bCs/>
+          <w:sz w:val="18"/>
+          <w:szCs w:val="18"/>
+        </w:rPr>
+        <w:t>TanggalAngka</w:t>
+      </w:r>
+      <w:proofErr w:type="spellEnd"/>
+      <w:r>
+        <w:rPr>
+          <w:b/>
+          <w:bCs/>
+          <w:sz w:val="18"/>
+          <w:szCs w:val="18"/>
+        </w:rPr>
+        <w:t>}}</w:t>
+      </w:r>
+      <w:r>
+        <w:rPr>
+          <w:b/>
+          <w:bCs/>
+          <w:sz w:val="18"/>
+          <w:szCs w:val="18"/>
+        </w:rPr>
+        <w:t xml:space="preserve"> </w:t>
+      </w:r>
+      <w:r>
+        <w:rPr>
+          <w:b/>
+          <w:bCs/>
+          <w:sz w:val="18"/>
+          <w:szCs w:val="18"/>
+        </w:rPr>
+        <w:t>{{</w:t>
+      </w:r>
+      <w:proofErr w:type="spellStart"/>
+      <w:r>
+        <w:rPr>
+          <w:b/>
+          <w:bCs/>
+          <w:sz w:val="18"/>
+          <w:szCs w:val="18"/>
+        </w:rPr>
+        <w:t>BulanTanggal</w:t>
+      </w:r>
+      <w:proofErr w:type="spellEnd"/>
+      <w:r>
+        <w:rPr>
+          <w:b/>
+          <w:bCs/>
+          <w:sz w:val="18"/>
+          <w:szCs w:val="18"/>
+        </w:rPr>
+        <w:t>}}</w:t>
+      </w:r>
+      <w:r>
+        <w:rPr>
+          <w:b/>
+          <w:bCs/>
+          <w:sz w:val="18"/>
+          <w:szCs w:val="18"/>
+        </w:rPr>
+        <w:t xml:space="preserve"> {{</w:t>
+      </w:r>
+      <w:proofErr w:type="spellStart"/>
+      <w:r>
+        <w:rPr>
+          <w:b/>
+          <w:bCs/>
+          <w:sz w:val="18"/>
+          <w:szCs w:val="18"/>
+        </w:rPr>
+        <w:t>TahunTanggal</w:t>
+      </w:r>
+      <w:proofErr w:type="spellEnd"/>
+      <w:r>
+        <w:rPr>
+          <w:b/>
+          <w:bCs/>
+          <w:sz w:val="18"/>
+          <w:szCs w:val="18"/>
+        </w:rPr>
+        <w:t xml:space="preserve">}} </w:t>
+      </w:r>
+      <w:proofErr w:type="spellStart"/>
+      <w:r>
+        <w:rPr>
+          <w:b/>
+          <w:bCs/>
+          <w:sz w:val="18"/>
+          <w:szCs w:val="18"/>
+        </w:rPr>
+        <w:t>telah</w:t>
+      </w:r>
+      <w:proofErr w:type="spellEnd"/>
+      <w:r>
+        <w:rPr>
+          <w:b/>
+          <w:bCs/>
+          <w:sz w:val="18"/>
+          <w:szCs w:val="18"/>
+        </w:rPr>
+        <w:t xml:space="preserve"> </w:t>
+      </w:r>
+      <w:proofErr w:type="spellStart"/>
+      <w:r>
+        <w:rPr>
+          <w:b/>
+          <w:bCs/>
+          <w:sz w:val="18"/>
+          <w:szCs w:val="18"/>
+        </w:rPr>
+        <w:t>diserahterimakan</w:t>
+      </w:r>
+      <w:proofErr w:type="spellEnd"/>
+      <w:r>
+        <w:rPr>
+          <w:b/>
+          <w:bCs/>
+          <w:sz w:val="18"/>
+          <w:szCs w:val="18"/>
+        </w:rPr>
+        <w:t xml:space="preserve"> </w:t>
+      </w:r>
+      <w:proofErr w:type="spellStart"/>
+      <w:r>
+        <w:rPr>
+          <w:b/>
+          <w:bCs/>
+          <w:sz w:val="18"/>
+          <w:szCs w:val="18"/>
+        </w:rPr>
+        <w:t>perangkat</w:t>
+      </w:r>
+      <w:proofErr w:type="spellEnd"/>
+      <w:r>
+        <w:rPr>
+          <w:b/>
+          <w:bCs/>
+          <w:sz w:val="18"/>
+          <w:szCs w:val="18"/>
+        </w:rPr>
+        <w:t xml:space="preserve"> </w:t>
+      </w:r>
+      <w:proofErr w:type="spellStart"/>
+      <w:r>
+        <w:rPr>
+          <w:b/>
+          <w:bCs/>
+          <w:sz w:val="18"/>
+          <w:szCs w:val="18"/>
+        </w:rPr>
+        <w:t>dengan</w:t>
+      </w:r>
+      <w:proofErr w:type="spellEnd"/>
+      <w:r>
+        <w:rPr>
+          <w:b/>
+          <w:bCs/>
+          <w:sz w:val="18"/>
+          <w:szCs w:val="18"/>
+        </w:rPr>
+        <w:t xml:space="preserve"> </w:t>
+      </w:r>
+      <w:proofErr w:type="spellStart"/>
+      <w:r>
+        <w:rPr>
+          <w:b/>
+          <w:bCs/>
+          <w:sz w:val="18"/>
+          <w:szCs w:val="18"/>
+        </w:rPr>
+        <w:t>spesifikasi</w:t>
+      </w:r>
+      <w:proofErr w:type="spellEnd"/>
+      <w:r>
+        <w:rPr>
+          <w:b/>
+          <w:bCs/>
+          <w:sz w:val="18"/>
+          <w:szCs w:val="18"/>
+        </w:rPr>
+        <w:t xml:space="preserve"> </w:t>
+      </w:r>
+      <w:proofErr w:type="spellStart"/>
+      <w:r>
+        <w:rPr>
+          <w:b/>
+          <w:bCs/>
+          <w:sz w:val="18"/>
+          <w:szCs w:val="18"/>
+        </w:rPr>
+        <w:t>serta</w:t>
+      </w:r>
+      <w:proofErr w:type="spellEnd"/>
+      <w:r>
+        <w:rPr>
+          <w:b/>
+          <w:bCs/>
+          <w:sz w:val="18"/>
+          <w:szCs w:val="18"/>
+        </w:rPr>
+        <w:t xml:space="preserve"> </w:t>
+      </w:r>
+      <w:proofErr w:type="spellStart"/>
+      <w:r>
+        <w:rPr>
+          <w:b/>
+          <w:bCs/>
+          <w:sz w:val="18"/>
+          <w:szCs w:val="18"/>
+        </w:rPr>
+        <w:t>syarat-syarat</w:t>
+      </w:r>
+      <w:proofErr w:type="spellEnd"/>
+      <w:r>
+        <w:rPr>
+          <w:b/>
+          <w:bCs/>
+          <w:sz w:val="18"/>
+          <w:szCs w:val="18"/>
+        </w:rPr>
+        <w:t xml:space="preserve"> dan </w:t>
+      </w:r>
+      <w:proofErr w:type="spellStart"/>
+      <w:r>
+        <w:rPr>
+          <w:b/>
+          <w:bCs/>
+          <w:sz w:val="18"/>
+          <w:szCs w:val="18"/>
+        </w:rPr>
+        <w:t>ketentuan</w:t>
+      </w:r>
+      <w:proofErr w:type="spellEnd"/>
+      <w:r>
+        <w:rPr>
+          <w:b/>
+          <w:bCs/>
+          <w:sz w:val="18"/>
+          <w:szCs w:val="18"/>
+        </w:rPr>
+        <w:t xml:space="preserve"> </w:t>
+      </w:r>
+      <w:proofErr w:type="spellStart"/>
+      <w:r>
+        <w:rPr>
+          <w:b/>
+          <w:bCs/>
+          <w:sz w:val="18"/>
+          <w:szCs w:val="18"/>
+        </w:rPr>
+        <w:t>sebagai</w:t>
+      </w:r>
+      <w:proofErr w:type="spellEnd"/>
+      <w:r>
+        <w:rPr>
+          <w:b/>
+          <w:bCs/>
+          <w:sz w:val="18"/>
+          <w:szCs w:val="18"/>
+        </w:rPr>
+        <w:t xml:space="preserve"> </w:t>
+      </w:r>
+      <w:proofErr w:type="spellStart"/>
+      <w:r>
+        <w:rPr>
+          <w:b/>
+          <w:bCs/>
+          <w:sz w:val="18"/>
+          <w:szCs w:val="18"/>
+        </w:rPr>
+        <w:t>berikut</w:t>
+      </w:r>
+      <w:proofErr w:type="spellEnd"/>
+      <w:r>
+        <w:rPr>
+          <w:b/>
+          <w:bCs/>
+          <w:sz w:val="18"/>
+          <w:szCs w:val="18"/>
+        </w:rPr>
+        <w:t>:</w:t>
       </w:r>
     </w:p>
     <w:p>
@@ -1301,7 +1822,7 @@
     </w:p>
     <w:p>
       <w:pPr>
-        <w:pStyle w:val="DaftarParagraf"/>
+        <w:pStyle w:val="ListParagraph"/>
         <w:numPr>
           <w:ilvl w:val="0"/>
           <w:numId w:val="1"/>
@@ -1352,7 +1873,7 @@
     </w:p>
     <w:tbl>
       <w:tblPr>
-        <w:tblStyle w:val="KisiTabel"/>
+        <w:tblStyle w:val="TableGrid"/>
         <w:tblW w:w="0" w:type="auto"/>
         <w:tblInd w:w="360" w:type="dxa"/>
         <w:tblLayout w:type="fixed"/>
@@ -1379,7 +1900,7 @@
           </w:tcPr>
           <w:tbl>
             <w:tblPr>
-              <w:tblStyle w:val="KisiTabel"/>
+              <w:tblStyle w:val="TableGrid"/>
               <w:tblW w:w="0" w:type="auto"/>
               <w:tblBorders>
                 <w:top w:val="none" w:sz="0" w:space="0" w:color="auto"/>
@@ -1401,7 +1922,7 @@
                 </w:tcPr>
                 <w:p>
                   <w:pPr>
-                    <w:pStyle w:val="DaftarParagraf"/>
+                    <w:pStyle w:val="ListParagraph"/>
                     <w:ind w:left="0"/>
                     <w:rPr>
                       <w:b/>
@@ -1422,7 +1943,7 @@
                 </w:tcPr>
                 <w:p>
                   <w:pPr>
-                    <w:pStyle w:val="DaftarParagraf"/>
+                    <w:pStyle w:val="ListParagraph"/>
                     <w:ind w:left="0"/>
                     <w:rPr>
                       <w:b/>
@@ -1454,7 +1975,7 @@
                 </w:tcPr>
                 <w:p>
                   <w:pPr>
-                    <w:pStyle w:val="DaftarParagraf"/>
+                    <w:pStyle w:val="ListParagraph"/>
                     <w:ind w:left="0"/>
                     <w:rPr>
                       <w:b/>
@@ -1471,7 +1992,7 @@
           </w:tbl>
           <w:p>
             <w:pPr>
-              <w:pStyle w:val="DaftarParagraf"/>
+              <w:pStyle w:val="ListParagraph"/>
               <w:ind w:left="0"/>
               <w:rPr>
                 <w:b/>
@@ -1491,7 +2012,7 @@
           </w:tcPr>
           <w:tbl>
             <w:tblPr>
-              <w:tblStyle w:val="KisiTabel"/>
+              <w:tblStyle w:val="TableGrid"/>
               <w:tblW w:w="0" w:type="auto"/>
               <w:tblBorders>
                 <w:top w:val="none" w:sz="0" w:space="0" w:color="auto"/>
@@ -1515,7 +2036,7 @@
                 </w:tcPr>
                 <w:p>
                   <w:pPr>
-                    <w:pStyle w:val="DaftarParagraf"/>
+                    <w:pStyle w:val="ListParagraph"/>
                     <w:ind w:left="0"/>
                     <w:jc w:val="center"/>
                     <w:rPr>
@@ -1548,7 +2069,7 @@
                 </w:tcPr>
                 <w:p>
                   <w:pPr>
-                    <w:pStyle w:val="DaftarParagraf"/>
+                    <w:pStyle w:val="ListParagraph"/>
                     <w:ind w:left="0"/>
                     <w:rPr>
                       <w:b/>
@@ -1567,7 +2088,7 @@
                 </w:tcPr>
                 <w:p>
                   <w:pPr>
-                    <w:pStyle w:val="DaftarParagraf"/>
+                    <w:pStyle w:val="ListParagraph"/>
                     <w:ind w:left="0"/>
                     <w:rPr>
                       <w:b/>
@@ -1588,7 +2109,7 @@
                 </w:tcPr>
                 <w:p>
                   <w:pPr>
-                    <w:pStyle w:val="DaftarParagraf"/>
+                    <w:pStyle w:val="ListParagraph"/>
                     <w:ind w:left="0"/>
                     <w:rPr>
                       <w:b/>
@@ -1618,7 +2139,7 @@
                 </w:tcPr>
                 <w:p>
                   <w:pPr>
-                    <w:pStyle w:val="DaftarParagraf"/>
+                    <w:pStyle w:val="ListParagraph"/>
                     <w:ind w:left="0"/>
                     <w:rPr>
                       <w:b/>
@@ -1646,7 +2167,7 @@
           </w:tbl>
           <w:p>
             <w:pPr>
-              <w:pStyle w:val="DaftarParagraf"/>
+              <w:pStyle w:val="ListParagraph"/>
               <w:ind w:left="0"/>
               <w:rPr>
                 <w:b/>
@@ -1668,7 +2189,7 @@
           </w:tcPr>
           <w:p>
             <w:pPr>
-              <w:pStyle w:val="DaftarParagraf"/>
+              <w:pStyle w:val="ListParagraph"/>
               <w:ind w:left="0"/>
               <w:rPr>
                 <w:b/>
@@ -1682,7 +2203,7 @@
           </w:p>
           <w:p>
             <w:pPr>
-              <w:pStyle w:val="DaftarParagraf"/>
+              <w:pStyle w:val="ListParagraph"/>
               <w:ind w:left="0"/>
               <w:jc w:val="center"/>
               <w:rPr>
@@ -1716,7 +2237,7 @@
           </w:tcPr>
           <w:p>
             <w:pPr>
-              <w:pStyle w:val="DaftarParagraf"/>
+              <w:pStyle w:val="ListParagraph"/>
               <w:ind w:left="0"/>
               <w:rPr>
                 <w:b/>
@@ -1730,7 +2251,7 @@
           </w:p>
           <w:p>
             <w:pPr>
-              <w:pStyle w:val="DaftarParagraf"/>
+              <w:pStyle w:val="ListParagraph"/>
               <w:ind w:left="0"/>
               <w:jc w:val="center"/>
               <w:rPr>
@@ -1764,7 +2285,7 @@
           </w:tcPr>
           <w:p>
             <w:pPr>
-              <w:pStyle w:val="DaftarParagraf"/>
+              <w:pStyle w:val="ListParagraph"/>
               <w:ind w:left="0"/>
               <w:jc w:val="center"/>
               <w:rPr>
@@ -1779,7 +2300,7 @@
           </w:p>
           <w:p>
             <w:pPr>
-              <w:pStyle w:val="DaftarParagraf"/>
+              <w:pStyle w:val="ListParagraph"/>
               <w:ind w:left="0"/>
               <w:jc w:val="center"/>
               <w:rPr>
@@ -1812,7 +2333,7 @@
           </w:tcPr>
           <w:p>
             <w:pPr>
-              <w:pStyle w:val="DaftarParagraf"/>
+              <w:pStyle w:val="ListParagraph"/>
               <w:ind w:left="0"/>
               <w:jc w:val="center"/>
               <w:rPr>
@@ -1839,7 +2360,7 @@
           </w:tcPr>
           <w:p>
             <w:pPr>
-              <w:pStyle w:val="DaftarParagraf"/>
+              <w:pStyle w:val="ListParagraph"/>
               <w:ind w:left="0"/>
               <w:jc w:val="center"/>
               <w:rPr>
@@ -1866,7 +2387,7 @@
           </w:tcPr>
           <w:p>
             <w:pPr>
-              <w:pStyle w:val="DaftarParagraf"/>
+              <w:pStyle w:val="ListParagraph"/>
               <w:ind w:left="0"/>
               <w:jc w:val="center"/>
               <w:rPr>
@@ -1893,7 +2414,7 @@
           </w:tcPr>
           <w:p>
             <w:pPr>
-              <w:pStyle w:val="DaftarParagraf"/>
+              <w:pStyle w:val="ListParagraph"/>
               <w:ind w:left="0"/>
               <w:jc w:val="center"/>
               <w:rPr>
@@ -1920,7 +2441,7 @@
           </w:tcPr>
           <w:p>
             <w:pPr>
-              <w:pStyle w:val="DaftarParagraf"/>
+              <w:pStyle w:val="ListParagraph"/>
               <w:ind w:left="0"/>
               <w:jc w:val="center"/>
               <w:rPr>
@@ -1947,7 +2468,7 @@
           </w:tcPr>
           <w:p>
             <w:pPr>
-              <w:pStyle w:val="DaftarParagraf"/>
+              <w:pStyle w:val="ListParagraph"/>
               <w:ind w:left="0"/>
               <w:jc w:val="center"/>
               <w:rPr>
@@ -1980,7 +2501,7 @@
           </w:tcPr>
           <w:p>
             <w:pPr>
-              <w:pStyle w:val="DaftarParagraf"/>
+              <w:pStyle w:val="ListParagraph"/>
               <w:ind w:left="0"/>
               <w:rPr>
                 <w:noProof/>
@@ -2001,7 +2522,7 @@
           </w:p>
           <w:p>
             <w:pPr>
-              <w:pStyle w:val="DaftarParagraf"/>
+              <w:pStyle w:val="ListParagraph"/>
               <w:ind w:left="0"/>
               <w:rPr>
                 <w:noProof/>
@@ -2030,7 +2551,7 @@
     </w:p>
     <w:p>
       <w:pPr>
-        <w:pStyle w:val="DaftarParagraf"/>
+        <w:pStyle w:val="ListParagraph"/>
         <w:numPr>
           <w:ilvl w:val="0"/>
           <w:numId w:val="1"/>
@@ -2043,17 +2564,426 @@
           <w:szCs w:val="18"/>
         </w:rPr>
       </w:pPr>
-      <w:r>
-        <w:rPr>
-          <w:sz w:val="18"/>
-          <w:szCs w:val="18"/>
-        </w:rPr>
-        <w:t>Pihak penerima bertanggung jawab sepenuhnya atas peralatan yang digunakannya dan telah membaca dan setuju dengan ketentuan tambahan yang tercantum pada halaman belakang dari lembar bukti penerimaan barang ini (wajib dibaca).</w:t>
+      <w:proofErr w:type="spellStart"/>
+      <w:r>
+        <w:rPr>
+          <w:sz w:val="18"/>
+          <w:szCs w:val="18"/>
+        </w:rPr>
+        <w:t>Pihak</w:t>
+      </w:r>
+      <w:proofErr w:type="spellEnd"/>
+      <w:r>
+        <w:rPr>
+          <w:sz w:val="18"/>
+          <w:szCs w:val="18"/>
+        </w:rPr>
+        <w:t xml:space="preserve"> </w:t>
+      </w:r>
+      <w:proofErr w:type="spellStart"/>
+      <w:r>
+        <w:rPr>
+          <w:sz w:val="18"/>
+          <w:szCs w:val="18"/>
+        </w:rPr>
+        <w:t>penerima</w:t>
+      </w:r>
+      <w:proofErr w:type="spellEnd"/>
+      <w:r>
+        <w:rPr>
+          <w:sz w:val="18"/>
+          <w:szCs w:val="18"/>
+        </w:rPr>
+        <w:t xml:space="preserve"> </w:t>
+      </w:r>
+      <w:proofErr w:type="spellStart"/>
+      <w:r>
+        <w:rPr>
+          <w:sz w:val="18"/>
+          <w:szCs w:val="18"/>
+        </w:rPr>
+        <w:t>bertanggung</w:t>
+      </w:r>
+      <w:proofErr w:type="spellEnd"/>
+      <w:r>
+        <w:rPr>
+          <w:sz w:val="18"/>
+          <w:szCs w:val="18"/>
+        </w:rPr>
+        <w:t xml:space="preserve"> </w:t>
+      </w:r>
+      <w:proofErr w:type="spellStart"/>
+      <w:r>
+        <w:rPr>
+          <w:sz w:val="18"/>
+          <w:szCs w:val="18"/>
+        </w:rPr>
+        <w:t>jawab</w:t>
+      </w:r>
+      <w:proofErr w:type="spellEnd"/>
+      <w:r>
+        <w:rPr>
+          <w:sz w:val="18"/>
+          <w:szCs w:val="18"/>
+        </w:rPr>
+        <w:t xml:space="preserve"> </w:t>
+      </w:r>
+      <w:proofErr w:type="spellStart"/>
+      <w:r>
+        <w:rPr>
+          <w:sz w:val="18"/>
+          <w:szCs w:val="18"/>
+        </w:rPr>
+        <w:t>sepenuhnya</w:t>
+      </w:r>
+      <w:proofErr w:type="spellEnd"/>
+      <w:r>
+        <w:rPr>
+          <w:sz w:val="18"/>
+          <w:szCs w:val="18"/>
+        </w:rPr>
+        <w:t xml:space="preserve"> </w:t>
+      </w:r>
+      <w:proofErr w:type="spellStart"/>
+      <w:r>
+        <w:rPr>
+          <w:sz w:val="18"/>
+          <w:szCs w:val="18"/>
+        </w:rPr>
+        <w:t>atas</w:t>
+      </w:r>
+      <w:proofErr w:type="spellEnd"/>
+      <w:r>
+        <w:rPr>
+          <w:sz w:val="18"/>
+          <w:szCs w:val="18"/>
+        </w:rPr>
+        <w:t xml:space="preserve"> </w:t>
+      </w:r>
+      <w:proofErr w:type="spellStart"/>
+      <w:r>
+        <w:rPr>
+          <w:sz w:val="18"/>
+          <w:szCs w:val="18"/>
+        </w:rPr>
+        <w:t>barang</w:t>
+      </w:r>
+      <w:proofErr w:type="spellEnd"/>
+      <w:r>
+        <w:rPr>
+          <w:sz w:val="18"/>
+          <w:szCs w:val="18"/>
+        </w:rPr>
+        <w:t>/</w:t>
+      </w:r>
+      <w:proofErr w:type="spellStart"/>
+      <w:r>
+        <w:rPr>
+          <w:sz w:val="18"/>
+          <w:szCs w:val="18"/>
+        </w:rPr>
+        <w:t>peralatan</w:t>
+      </w:r>
+      <w:proofErr w:type="spellEnd"/>
+      <w:r>
+        <w:rPr>
+          <w:sz w:val="18"/>
+          <w:szCs w:val="18"/>
+        </w:rPr>
+        <w:t xml:space="preserve"> yang </w:t>
+      </w:r>
+      <w:proofErr w:type="spellStart"/>
+      <w:r>
+        <w:rPr>
+          <w:sz w:val="18"/>
+          <w:szCs w:val="18"/>
+        </w:rPr>
+        <w:t>diterima</w:t>
+      </w:r>
+      <w:proofErr w:type="spellEnd"/>
+      <w:r>
+        <w:rPr>
+          <w:sz w:val="18"/>
+          <w:szCs w:val="18"/>
+        </w:rPr>
+        <w:t xml:space="preserve"> dan </w:t>
+      </w:r>
+      <w:proofErr w:type="spellStart"/>
+      <w:r>
+        <w:rPr>
+          <w:sz w:val="18"/>
+          <w:szCs w:val="18"/>
+        </w:rPr>
+        <w:t>digunakan</w:t>
+      </w:r>
+      <w:proofErr w:type="spellEnd"/>
+      <w:r>
+        <w:rPr>
+          <w:sz w:val="18"/>
+          <w:szCs w:val="18"/>
+        </w:rPr>
+        <w:t xml:space="preserve"> </w:t>
+      </w:r>
+      <w:proofErr w:type="spellStart"/>
+      <w:r>
+        <w:rPr>
+          <w:sz w:val="18"/>
+          <w:szCs w:val="18"/>
+        </w:rPr>
+        <w:t>serta</w:t>
+      </w:r>
+      <w:proofErr w:type="spellEnd"/>
+      <w:r>
+        <w:rPr>
+          <w:sz w:val="18"/>
+          <w:szCs w:val="18"/>
+        </w:rPr>
+        <w:t xml:space="preserve"> </w:t>
+      </w:r>
+      <w:proofErr w:type="spellStart"/>
+      <w:r>
+        <w:rPr>
+          <w:sz w:val="18"/>
+          <w:szCs w:val="18"/>
+        </w:rPr>
+        <w:t>menyatakan</w:t>
+      </w:r>
+      <w:proofErr w:type="spellEnd"/>
+      <w:r>
+        <w:rPr>
+          <w:sz w:val="18"/>
+          <w:szCs w:val="18"/>
+        </w:rPr>
+        <w:t xml:space="preserve"> </w:t>
+      </w:r>
+      <w:proofErr w:type="spellStart"/>
+      <w:r>
+        <w:rPr>
+          <w:sz w:val="18"/>
+          <w:szCs w:val="18"/>
+        </w:rPr>
+        <w:t>telah</w:t>
+      </w:r>
+      <w:proofErr w:type="spellEnd"/>
+      <w:r>
+        <w:rPr>
+          <w:sz w:val="18"/>
+          <w:szCs w:val="18"/>
+        </w:rPr>
+        <w:t xml:space="preserve"> </w:t>
+      </w:r>
+      <w:proofErr w:type="spellStart"/>
+      <w:r>
+        <w:rPr>
+          <w:sz w:val="18"/>
+          <w:szCs w:val="18"/>
+        </w:rPr>
+        <w:t>membaca</w:t>
+      </w:r>
+      <w:proofErr w:type="spellEnd"/>
+      <w:r>
+        <w:rPr>
+          <w:sz w:val="18"/>
+          <w:szCs w:val="18"/>
+        </w:rPr>
+        <w:t xml:space="preserve">, </w:t>
+      </w:r>
+      <w:proofErr w:type="spellStart"/>
+      <w:r>
+        <w:rPr>
+          <w:sz w:val="18"/>
+          <w:szCs w:val="18"/>
+        </w:rPr>
+        <w:t>memahami</w:t>
+      </w:r>
+      <w:proofErr w:type="spellEnd"/>
+      <w:r>
+        <w:rPr>
+          <w:sz w:val="18"/>
+          <w:szCs w:val="18"/>
+        </w:rPr>
+        <w:t xml:space="preserve">, dan </w:t>
+      </w:r>
+      <w:proofErr w:type="spellStart"/>
+      <w:r>
+        <w:rPr>
+          <w:sz w:val="18"/>
+          <w:szCs w:val="18"/>
+        </w:rPr>
+        <w:t>menyetujui</w:t>
+      </w:r>
+      <w:proofErr w:type="spellEnd"/>
+      <w:r>
+        <w:rPr>
+          <w:sz w:val="18"/>
+          <w:szCs w:val="18"/>
+        </w:rPr>
+        <w:t xml:space="preserve"> </w:t>
+      </w:r>
+      <w:proofErr w:type="spellStart"/>
+      <w:r>
+        <w:rPr>
+          <w:sz w:val="18"/>
+          <w:szCs w:val="18"/>
+        </w:rPr>
+        <w:t>seluruh</w:t>
+      </w:r>
+      <w:proofErr w:type="spellEnd"/>
+      <w:r>
+        <w:rPr>
+          <w:sz w:val="18"/>
+          <w:szCs w:val="18"/>
+        </w:rPr>
+        <w:t xml:space="preserve"> </w:t>
+      </w:r>
+      <w:proofErr w:type="spellStart"/>
+      <w:r>
+        <w:rPr>
+          <w:sz w:val="18"/>
+          <w:szCs w:val="18"/>
+        </w:rPr>
+        <w:t>ketentuan</w:t>
+      </w:r>
+      <w:proofErr w:type="spellEnd"/>
+      <w:r>
+        <w:rPr>
+          <w:sz w:val="18"/>
+          <w:szCs w:val="18"/>
+        </w:rPr>
+        <w:t xml:space="preserve"> yang </w:t>
+      </w:r>
+      <w:proofErr w:type="spellStart"/>
+      <w:r>
+        <w:rPr>
+          <w:sz w:val="18"/>
+          <w:szCs w:val="18"/>
+        </w:rPr>
+        <w:t>tercantum</w:t>
+      </w:r>
+      <w:proofErr w:type="spellEnd"/>
+      <w:r>
+        <w:rPr>
+          <w:sz w:val="18"/>
+          <w:szCs w:val="18"/>
+        </w:rPr>
+        <w:t xml:space="preserve"> </w:t>
+      </w:r>
+      <w:proofErr w:type="spellStart"/>
+      <w:r>
+        <w:rPr>
+          <w:sz w:val="18"/>
+          <w:szCs w:val="18"/>
+        </w:rPr>
+        <w:t>dalam</w:t>
+      </w:r>
+      <w:proofErr w:type="spellEnd"/>
+      <w:r>
+        <w:rPr>
+          <w:sz w:val="18"/>
+          <w:szCs w:val="18"/>
+        </w:rPr>
+        <w:t xml:space="preserve"> Berita Acara Serah </w:t>
+      </w:r>
+      <w:proofErr w:type="spellStart"/>
+      <w:r>
+        <w:rPr>
+          <w:sz w:val="18"/>
+          <w:szCs w:val="18"/>
+        </w:rPr>
+        <w:t>Terima</w:t>
+      </w:r>
+      <w:proofErr w:type="spellEnd"/>
+      <w:r>
+        <w:rPr>
+          <w:sz w:val="18"/>
+          <w:szCs w:val="18"/>
+        </w:rPr>
+        <w:t xml:space="preserve"> </w:t>
+      </w:r>
+      <w:proofErr w:type="spellStart"/>
+      <w:r>
+        <w:rPr>
+          <w:sz w:val="18"/>
+          <w:szCs w:val="18"/>
+        </w:rPr>
+        <w:t>ini</w:t>
+      </w:r>
+      <w:proofErr w:type="spellEnd"/>
+      <w:r>
+        <w:rPr>
+          <w:sz w:val="18"/>
+          <w:szCs w:val="18"/>
+        </w:rPr>
+        <w:t xml:space="preserve"> </w:t>
+      </w:r>
+      <w:proofErr w:type="spellStart"/>
+      <w:r>
+        <w:rPr>
+          <w:sz w:val="18"/>
+          <w:szCs w:val="18"/>
+        </w:rPr>
+        <w:t>beserta</w:t>
+      </w:r>
+      <w:proofErr w:type="spellEnd"/>
+      <w:r>
+        <w:rPr>
+          <w:sz w:val="18"/>
+          <w:szCs w:val="18"/>
+        </w:rPr>
+        <w:t xml:space="preserve"> </w:t>
+      </w:r>
+      <w:proofErr w:type="spellStart"/>
+      <w:r>
+        <w:rPr>
+          <w:sz w:val="18"/>
+          <w:szCs w:val="18"/>
+        </w:rPr>
+        <w:t>ketentuan</w:t>
+      </w:r>
+      <w:proofErr w:type="spellEnd"/>
+      <w:r>
+        <w:rPr>
+          <w:sz w:val="18"/>
+          <w:szCs w:val="18"/>
+        </w:rPr>
+        <w:t xml:space="preserve"> </w:t>
+      </w:r>
+      <w:proofErr w:type="spellStart"/>
+      <w:r>
+        <w:rPr>
+          <w:sz w:val="18"/>
+          <w:szCs w:val="18"/>
+        </w:rPr>
+        <w:t>tambahan</w:t>
+      </w:r>
+      <w:proofErr w:type="spellEnd"/>
+      <w:r>
+        <w:rPr>
+          <w:sz w:val="18"/>
+          <w:szCs w:val="18"/>
+        </w:rPr>
+        <w:t xml:space="preserve"> yang </w:t>
+      </w:r>
+      <w:proofErr w:type="spellStart"/>
+      <w:r>
+        <w:rPr>
+          <w:sz w:val="18"/>
+          <w:szCs w:val="18"/>
+        </w:rPr>
+        <w:t>berlaku</w:t>
+      </w:r>
+      <w:proofErr w:type="spellEnd"/>
+      <w:r>
+        <w:rPr>
+          <w:sz w:val="18"/>
+          <w:szCs w:val="18"/>
+        </w:rPr>
+        <w:t>.</w:t>
       </w:r>
     </w:p>
     <w:p>
       <w:pPr>
-        <w:pStyle w:val="DaftarParagraf"/>
+        <w:pStyle w:val="ListParagraph"/>
         <w:spacing w:after="120" w:line="276" w:lineRule="auto"/>
         <w:ind w:left="360"/>
         <w:jc w:val="both"/>
@@ -2065,7 +2995,7 @@
     </w:p>
     <w:p>
       <w:pPr>
-        <w:pStyle w:val="DaftarParagraf"/>
+        <w:pStyle w:val="ListParagraph"/>
         <w:numPr>
           <w:ilvl w:val="0"/>
           <w:numId w:val="1"/>
@@ -2079,19 +3009,492 @@
           <w:lang w:val="nb-NO"/>
         </w:rPr>
       </w:pPr>
-      <w:r>
-        <w:rPr>
-          <w:sz w:val="18"/>
-          <w:szCs w:val="18"/>
-        </w:rPr>
-        <w:t xml:space="preserve">Apabila terjadi pencurian/kehilangan perangkat yang diserahkan kepada pemakai/penanggung jawab, maka pemakai/penanggung jawab harus melaporkan kepada Kepolisian dan Sekuriti PERTAMINA dimana </w:t>
-      </w:r>
-      <w:r>
-        <w:rPr>
-          <w:sz w:val="18"/>
-          <w:szCs w:val="18"/>
-        </w:rPr>
-        <w:t xml:space="preserve">terjadi pencurian/kehilangan barang tersebut. </w:t>
+      <w:proofErr w:type="spellStart"/>
+      <w:r>
+        <w:rPr>
+          <w:sz w:val="18"/>
+          <w:szCs w:val="18"/>
+        </w:rPr>
+        <w:t>Apabila</w:t>
+      </w:r>
+      <w:proofErr w:type="spellEnd"/>
+      <w:r>
+        <w:rPr>
+          <w:sz w:val="18"/>
+          <w:szCs w:val="18"/>
+        </w:rPr>
+        <w:t xml:space="preserve"> </w:t>
+      </w:r>
+      <w:proofErr w:type="spellStart"/>
+      <w:r>
+        <w:rPr>
+          <w:sz w:val="18"/>
+          <w:szCs w:val="18"/>
+        </w:rPr>
+        <w:t>terjadi</w:t>
+      </w:r>
+      <w:proofErr w:type="spellEnd"/>
+      <w:r>
+        <w:rPr>
+          <w:sz w:val="18"/>
+          <w:szCs w:val="18"/>
+        </w:rPr>
+        <w:t xml:space="preserve"> </w:t>
+      </w:r>
+      <w:proofErr w:type="spellStart"/>
+      <w:r>
+        <w:rPr>
+          <w:sz w:val="18"/>
+          <w:szCs w:val="18"/>
+        </w:rPr>
+        <w:t>kehilangan</w:t>
+      </w:r>
+      <w:proofErr w:type="spellEnd"/>
+      <w:r>
+        <w:rPr>
+          <w:sz w:val="18"/>
+          <w:szCs w:val="18"/>
+        </w:rPr>
+        <w:t xml:space="preserve">, </w:t>
+      </w:r>
+      <w:proofErr w:type="spellStart"/>
+      <w:r>
+        <w:rPr>
+          <w:sz w:val="18"/>
+          <w:szCs w:val="18"/>
+        </w:rPr>
+        <w:t>pencurian</w:t>
+      </w:r>
+      <w:proofErr w:type="spellEnd"/>
+      <w:r>
+        <w:rPr>
+          <w:sz w:val="18"/>
+          <w:szCs w:val="18"/>
+        </w:rPr>
+        <w:t xml:space="preserve">, </w:t>
+      </w:r>
+      <w:proofErr w:type="spellStart"/>
+      <w:r>
+        <w:rPr>
+          <w:sz w:val="18"/>
+          <w:szCs w:val="18"/>
+        </w:rPr>
+        <w:t>kerusakan</w:t>
+      </w:r>
+      <w:proofErr w:type="spellEnd"/>
+      <w:r>
+        <w:rPr>
+          <w:sz w:val="18"/>
+          <w:szCs w:val="18"/>
+        </w:rPr>
+        <w:t xml:space="preserve"> </w:t>
+      </w:r>
+      <w:proofErr w:type="spellStart"/>
+      <w:r>
+        <w:rPr>
+          <w:sz w:val="18"/>
+          <w:szCs w:val="18"/>
+        </w:rPr>
+        <w:t>akibat</w:t>
+      </w:r>
+      <w:proofErr w:type="spellEnd"/>
+      <w:r>
+        <w:rPr>
+          <w:sz w:val="18"/>
+          <w:szCs w:val="18"/>
+        </w:rPr>
+        <w:t xml:space="preserve"> </w:t>
+      </w:r>
+      <w:proofErr w:type="spellStart"/>
+      <w:r>
+        <w:rPr>
+          <w:sz w:val="18"/>
+          <w:szCs w:val="18"/>
+        </w:rPr>
+        <w:t>kelalaian</w:t>
+      </w:r>
+      <w:proofErr w:type="spellEnd"/>
+      <w:r>
+        <w:rPr>
+          <w:sz w:val="18"/>
+          <w:szCs w:val="18"/>
+        </w:rPr>
+        <w:t xml:space="preserve">, </w:t>
+      </w:r>
+      <w:proofErr w:type="spellStart"/>
+      <w:r>
+        <w:rPr>
+          <w:sz w:val="18"/>
+          <w:szCs w:val="18"/>
+        </w:rPr>
+        <w:t>atau</w:t>
+      </w:r>
+      <w:proofErr w:type="spellEnd"/>
+      <w:r>
+        <w:rPr>
+          <w:sz w:val="18"/>
+          <w:szCs w:val="18"/>
+        </w:rPr>
+        <w:t xml:space="preserve"> </w:t>
+      </w:r>
+      <w:proofErr w:type="spellStart"/>
+      <w:r>
+        <w:rPr>
+          <w:sz w:val="18"/>
+          <w:szCs w:val="18"/>
+        </w:rPr>
+        <w:t>penyalahgunaan</w:t>
+      </w:r>
+      <w:proofErr w:type="spellEnd"/>
+      <w:r>
+        <w:rPr>
+          <w:sz w:val="18"/>
+          <w:szCs w:val="18"/>
+        </w:rPr>
+        <w:t xml:space="preserve"> </w:t>
+      </w:r>
+      <w:proofErr w:type="spellStart"/>
+      <w:r>
+        <w:rPr>
+          <w:sz w:val="18"/>
+          <w:szCs w:val="18"/>
+        </w:rPr>
+        <w:t>terhadap</w:t>
+      </w:r>
+      <w:proofErr w:type="spellEnd"/>
+      <w:r>
+        <w:rPr>
+          <w:sz w:val="18"/>
+          <w:szCs w:val="18"/>
+        </w:rPr>
+        <w:t xml:space="preserve"> </w:t>
+      </w:r>
+      <w:proofErr w:type="spellStart"/>
+      <w:r>
+        <w:rPr>
+          <w:sz w:val="18"/>
+          <w:szCs w:val="18"/>
+        </w:rPr>
+        <w:t>barang</w:t>
+      </w:r>
+      <w:proofErr w:type="spellEnd"/>
+      <w:r>
+        <w:rPr>
+          <w:sz w:val="18"/>
+          <w:szCs w:val="18"/>
+        </w:rPr>
+        <w:t>/</w:t>
+      </w:r>
+      <w:proofErr w:type="spellStart"/>
+      <w:r>
+        <w:rPr>
+          <w:sz w:val="18"/>
+          <w:szCs w:val="18"/>
+        </w:rPr>
+        <w:t>peralatan</w:t>
+      </w:r>
+      <w:proofErr w:type="spellEnd"/>
+      <w:r>
+        <w:rPr>
+          <w:sz w:val="18"/>
+          <w:szCs w:val="18"/>
+        </w:rPr>
+        <w:t xml:space="preserve"> yang </w:t>
+      </w:r>
+      <w:proofErr w:type="spellStart"/>
+      <w:r>
+        <w:rPr>
+          <w:sz w:val="18"/>
+          <w:szCs w:val="18"/>
+        </w:rPr>
+        <w:t>diserahkan</w:t>
+      </w:r>
+      <w:proofErr w:type="spellEnd"/>
+      <w:r>
+        <w:rPr>
+          <w:sz w:val="18"/>
+          <w:szCs w:val="18"/>
+        </w:rPr>
+        <w:t xml:space="preserve">, </w:t>
+      </w:r>
+      <w:proofErr w:type="spellStart"/>
+      <w:r>
+        <w:rPr>
+          <w:sz w:val="18"/>
+          <w:szCs w:val="18"/>
+        </w:rPr>
+        <w:t>maka</w:t>
+      </w:r>
+      <w:proofErr w:type="spellEnd"/>
+      <w:r>
+        <w:rPr>
+          <w:sz w:val="18"/>
+          <w:szCs w:val="18"/>
+        </w:rPr>
+        <w:t xml:space="preserve"> </w:t>
+      </w:r>
+      <w:proofErr w:type="spellStart"/>
+      <w:r>
+        <w:rPr>
+          <w:sz w:val="18"/>
+          <w:szCs w:val="18"/>
+        </w:rPr>
+        <w:t>pihak</w:t>
+      </w:r>
+      <w:proofErr w:type="spellEnd"/>
+      <w:r>
+        <w:rPr>
+          <w:sz w:val="18"/>
+          <w:szCs w:val="18"/>
+        </w:rPr>
+        <w:t xml:space="preserve"> </w:t>
+      </w:r>
+      <w:proofErr w:type="spellStart"/>
+      <w:r>
+        <w:rPr>
+          <w:sz w:val="18"/>
+          <w:szCs w:val="18"/>
+        </w:rPr>
+        <w:t>penerima</w:t>
+      </w:r>
+      <w:proofErr w:type="spellEnd"/>
+      <w:r>
+        <w:rPr>
+          <w:sz w:val="18"/>
+          <w:szCs w:val="18"/>
+        </w:rPr>
+        <w:t xml:space="preserve"> </w:t>
+      </w:r>
+      <w:proofErr w:type="spellStart"/>
+      <w:r>
+        <w:rPr>
+          <w:sz w:val="18"/>
+          <w:szCs w:val="18"/>
+        </w:rPr>
+        <w:t>wajib</w:t>
+      </w:r>
+      <w:proofErr w:type="spellEnd"/>
+      <w:r>
+        <w:rPr>
+          <w:sz w:val="18"/>
+          <w:szCs w:val="18"/>
+        </w:rPr>
+        <w:t xml:space="preserve"> </w:t>
+      </w:r>
+      <w:proofErr w:type="spellStart"/>
+      <w:r>
+        <w:rPr>
+          <w:sz w:val="18"/>
+          <w:szCs w:val="18"/>
+        </w:rPr>
+        <w:t>segera</w:t>
+      </w:r>
+      <w:proofErr w:type="spellEnd"/>
+      <w:r>
+        <w:rPr>
+          <w:sz w:val="18"/>
+          <w:szCs w:val="18"/>
+        </w:rPr>
+        <w:t xml:space="preserve"> </w:t>
+      </w:r>
+      <w:proofErr w:type="spellStart"/>
+      <w:r>
+        <w:rPr>
+          <w:sz w:val="18"/>
+          <w:szCs w:val="18"/>
+        </w:rPr>
+        <w:t>melaporkan</w:t>
+      </w:r>
+      <w:r>
+        <w:rPr>
+          <w:sz w:val="18"/>
+          <w:szCs w:val="18"/>
+        </w:rPr>
+        <w:t>nya</w:t>
+      </w:r>
+      <w:proofErr w:type="spellEnd"/>
+      <w:r>
+        <w:rPr>
+          <w:sz w:val="18"/>
+          <w:szCs w:val="18"/>
+        </w:rPr>
+        <w:t xml:space="preserve"> </w:t>
+      </w:r>
+      <w:proofErr w:type="spellStart"/>
+      <w:r>
+        <w:rPr>
+          <w:sz w:val="18"/>
+          <w:szCs w:val="18"/>
+        </w:rPr>
+        <w:t>kepada</w:t>
+      </w:r>
+      <w:proofErr w:type="spellEnd"/>
+      <w:r>
+        <w:rPr>
+          <w:sz w:val="18"/>
+          <w:szCs w:val="18"/>
+        </w:rPr>
+        <w:t xml:space="preserve"> </w:t>
+      </w:r>
+      <w:proofErr w:type="spellStart"/>
+      <w:r>
+        <w:rPr>
+          <w:sz w:val="18"/>
+          <w:szCs w:val="18"/>
+        </w:rPr>
+        <w:t>atasan</w:t>
+      </w:r>
+      <w:proofErr w:type="spellEnd"/>
+      <w:r>
+        <w:rPr>
+          <w:sz w:val="18"/>
+          <w:szCs w:val="18"/>
+        </w:rPr>
+        <w:t xml:space="preserve"> </w:t>
+      </w:r>
+      <w:proofErr w:type="spellStart"/>
+      <w:r>
+        <w:rPr>
+          <w:sz w:val="18"/>
+          <w:szCs w:val="18"/>
+        </w:rPr>
+        <w:t>langsung</w:t>
+      </w:r>
+      <w:proofErr w:type="spellEnd"/>
+      <w:r>
+        <w:rPr>
+          <w:sz w:val="18"/>
+          <w:szCs w:val="18"/>
+        </w:rPr>
+        <w:t xml:space="preserve">, </w:t>
+      </w:r>
+      <w:proofErr w:type="spellStart"/>
+      <w:r>
+        <w:rPr>
+          <w:sz w:val="18"/>
+          <w:szCs w:val="18"/>
+        </w:rPr>
+        <w:t>fungsi</w:t>
+      </w:r>
+      <w:proofErr w:type="spellEnd"/>
+      <w:r>
+        <w:rPr>
+          <w:sz w:val="18"/>
+          <w:szCs w:val="18"/>
+        </w:rPr>
+        <w:t xml:space="preserve"> </w:t>
+      </w:r>
+      <w:proofErr w:type="spellStart"/>
+      <w:r>
+        <w:rPr>
+          <w:sz w:val="18"/>
+          <w:szCs w:val="18"/>
+        </w:rPr>
+        <w:t>terkait</w:t>
+      </w:r>
+      <w:proofErr w:type="spellEnd"/>
+      <w:r>
+        <w:rPr>
+          <w:sz w:val="18"/>
+          <w:szCs w:val="18"/>
+        </w:rPr>
+        <w:t xml:space="preserve">, </w:t>
+      </w:r>
+      <w:proofErr w:type="spellStart"/>
+      <w:r>
+        <w:rPr>
+          <w:sz w:val="18"/>
+          <w:szCs w:val="18"/>
+        </w:rPr>
+        <w:t>serta</w:t>
+      </w:r>
+      <w:proofErr w:type="spellEnd"/>
+      <w:r>
+        <w:rPr>
+          <w:sz w:val="18"/>
+          <w:szCs w:val="18"/>
+        </w:rPr>
+        <w:t xml:space="preserve"> </w:t>
+      </w:r>
+      <w:proofErr w:type="spellStart"/>
+      <w:r>
+        <w:rPr>
+          <w:sz w:val="18"/>
+          <w:szCs w:val="18"/>
+        </w:rPr>
+        <w:t>pihak</w:t>
+      </w:r>
+      <w:proofErr w:type="spellEnd"/>
+      <w:r>
+        <w:rPr>
+          <w:sz w:val="18"/>
+          <w:szCs w:val="18"/>
+        </w:rPr>
+        <w:t xml:space="preserve"> yang </w:t>
+      </w:r>
+      <w:proofErr w:type="spellStart"/>
+      <w:r>
+        <w:rPr>
+          <w:sz w:val="18"/>
+          <w:szCs w:val="18"/>
+        </w:rPr>
+        <w:t>berwenang</w:t>
+      </w:r>
+      <w:proofErr w:type="spellEnd"/>
+      <w:r>
+        <w:rPr>
+          <w:sz w:val="18"/>
+          <w:szCs w:val="18"/>
+        </w:rPr>
+        <w:t xml:space="preserve"> </w:t>
+      </w:r>
+      <w:proofErr w:type="spellStart"/>
+      <w:r>
+        <w:rPr>
+          <w:sz w:val="18"/>
+          <w:szCs w:val="18"/>
+        </w:rPr>
+        <w:t>sesuai</w:t>
+      </w:r>
+      <w:proofErr w:type="spellEnd"/>
+      <w:r>
+        <w:rPr>
+          <w:sz w:val="18"/>
+          <w:szCs w:val="18"/>
+        </w:rPr>
+        <w:t xml:space="preserve"> </w:t>
+      </w:r>
+      <w:proofErr w:type="spellStart"/>
+      <w:r>
+        <w:rPr>
+          <w:sz w:val="18"/>
+          <w:szCs w:val="18"/>
+        </w:rPr>
+        <w:t>dengan</w:t>
+      </w:r>
+      <w:proofErr w:type="spellEnd"/>
+      <w:r>
+        <w:rPr>
+          <w:sz w:val="18"/>
+          <w:szCs w:val="18"/>
+        </w:rPr>
+        <w:t xml:space="preserve"> </w:t>
+      </w:r>
+      <w:proofErr w:type="spellStart"/>
+      <w:r>
+        <w:rPr>
+          <w:sz w:val="18"/>
+          <w:szCs w:val="18"/>
+        </w:rPr>
+        <w:t>ketentuan</w:t>
+      </w:r>
+      <w:proofErr w:type="spellEnd"/>
+      <w:r>
+        <w:rPr>
+          <w:sz w:val="18"/>
+          <w:szCs w:val="18"/>
+        </w:rPr>
+        <w:t xml:space="preserve"> Perusahaan. </w:t>
       </w:r>
       <w:r>
         <w:rPr>
@@ -2099,12 +3502,12 @@
           <w:szCs w:val="18"/>
           <w:lang w:val="nb-NO"/>
         </w:rPr>
-        <w:t>Laporan tsb akan diproses oleh pihak berwenang sesuai dengan peraturan yang berlaku.</w:t>
+        <w:t>Proses penanganan akan dilakukan sesuai dengan peraturan dan kebijakan yang berlaku.</w:t>
       </w:r>
     </w:p>
     <w:p>
       <w:pPr>
-        <w:pStyle w:val="DaftarParagraf"/>
+        <w:pStyle w:val="ListParagraph"/>
         <w:spacing w:after="120" w:line="276" w:lineRule="auto"/>
         <w:ind w:left="360"/>
         <w:jc w:val="both"/>
@@ -2117,7 +3520,7 @@
     </w:p>
     <w:p>
       <w:pPr>
-        <w:pStyle w:val="DaftarParagraf"/>
+        <w:pStyle w:val="ListParagraph"/>
         <w:numPr>
           <w:ilvl w:val="0"/>
           <w:numId w:val="1"/>
@@ -2137,33 +3540,20 @@
           <w:szCs w:val="18"/>
           <w:lang w:val="nb-NO"/>
         </w:rPr>
-        <w:t>Perangkat Notebook yang dipinjamkan adalah milik PT Pertamina Patra Niaga Regional Sumbagsel. Jika terjadi pencurian/kehilangan selama masa peminjaman maka Perusahaan tidak wajib memberikan pengganti notebook dan pekerja wajib menyediakan notebook pengganti sesuai spesifikasi hardware, software, OS yang ditentukan Perusahaan. Perangkat pengganti tetap akan dikelola oleh Perusahaan.</w:t>
+        <w:t>Barang/peralatan yang dialokasikan/dipinjamkan merupakan aset milik PT Pertamina Patra Niaga Regional Sumbagsel. Selama masa peminjaman, pihak penerima bertanggung jawab atas keamanan, penggunaan, pemeliharaan, dan kondisi barang/peralatan tersebut. Apabila terjadi kehilangan atau kerusakan akibat kelalaian penerima, maka penyelesaian dan penggantian akan dilakukan sesuai dengan ketentuan Perusahaan. Barang/peralatan yang dipinjamkan tetap menjadi milik Perusahaan dan wajib dikembalikan dalam kondisi baik ketika masa peminjaman berakhir atau apabila diminta kembali oleh Perusahaan</w:t>
+      </w:r>
+      <w:r>
+        <w:rPr>
+          <w:sz w:val="18"/>
+          <w:szCs w:val="18"/>
+          <w:lang w:val="nb-NO"/>
+        </w:rPr>
+        <w:t>.</w:t>
       </w:r>
     </w:p>
     <w:p>
       <w:pPr>
-        <w:pStyle w:val="DaftarParagraf"/>
-        <w:spacing w:after="120" w:line="276" w:lineRule="auto"/>
-        <w:ind w:left="360"/>
-        <w:jc w:val="both"/>
-        <w:rPr>
-          <w:sz w:val="18"/>
-          <w:szCs w:val="18"/>
-          <w:lang w:val="nb-NO"/>
-        </w:rPr>
-      </w:pPr>
-      <w:r>
-        <w:rPr>
-          <w:sz w:val="18"/>
-          <w:szCs w:val="18"/>
-          <w:lang w:val="nb-NO"/>
-        </w:rPr>
-        <w:t>Notebook peminjaman akan ditarik oleh Perusahaan apabila Pekerja yang bersangkutan berstatus Pemutusan Hubungan Kerja/Resign/Pensiun Dini atau akan menjalani MPPK dalam jangka waktu kurang dari 3 bulan atau 9 bulan sebelum Pensiun dengan Perusahaan selama masa peminjaman.</w:t>
-      </w:r>
-    </w:p>
-    <w:p>
-      <w:pPr>
-        <w:pStyle w:val="DaftarParagraf"/>
+        <w:pStyle w:val="ListParagraph"/>
         <w:spacing w:after="120" w:line="276" w:lineRule="auto"/>
         <w:ind w:left="360"/>
         <w:jc w:val="both"/>
@@ -2176,7 +3566,7 @@
     </w:p>
     <w:p>
       <w:pPr>
-        <w:pStyle w:val="DaftarParagraf"/>
+        <w:pStyle w:val="ListParagraph"/>
         <w:numPr>
           <w:ilvl w:val="0"/>
           <w:numId w:val="1"/>
@@ -2196,7 +3586,7 @@
           <w:szCs w:val="18"/>
           <w:lang w:val="nb-NO"/>
         </w:rPr>
-        <w:t>Telah dilakukan uji-coba terhadap perangkat-keras dan perangkat-lunak yang terpasang tersebut di atas yang dilaksanakan oleh petugas dari IT Sumbagsel dan pihak penerima sebagai pemakai/penanggung jawab, semua sepakat bahwa semua peralatan tersebut telah sesuai seperti tercantum di atas dan bekerja dengan baik serta laik pakai, sebagai berikut</w:t>
+        <w:t>Barang/peralatan yang diserahterimakan telah diperiksa dan/atau diuji fungsinya oleh petugas yang berwenang bersama pihak penerima. Dengan ditandatanganinya Berita Acara Serah Terima ini, pihak penerima menyatakan bahwa barang/peralatan telah diterima dalam kondisi baik, lengkap, berfungsi sebagaimana mestinya, serta sesuai dengan spesifikasi yang tercantum dalam dokumen ini</w:t>
       </w:r>
       <w:r>
         <w:rPr>
@@ -2204,23 +3594,25 @@
           <w:szCs w:val="18"/>
           <w:lang w:val="nb-NO"/>
         </w:rPr>
-        <w:t>:</w:t>
+        <w:t>.</w:t>
       </w:r>
     </w:p>
     <w:p>
       <w:pPr>
-        <w:pStyle w:val="DaftarParagraf"/>
+        <w:pStyle w:val="ListParagraph"/>
         <w:spacing w:after="120" w:line="276" w:lineRule="auto"/>
         <w:ind w:left="360"/>
         <w:jc w:val="both"/>
         <w:rPr>
+          <w:sz w:val="18"/>
+          <w:szCs w:val="18"/>
           <w:lang w:val="nb-NO"/>
         </w:rPr>
       </w:pPr>
     </w:p>
     <w:p>
       <w:pPr>
-        <w:pStyle w:val="DaftarParagraf"/>
+        <w:pStyle w:val="ListParagraph"/>
         <w:numPr>
           <w:ilvl w:val="0"/>
           <w:numId w:val="1"/>
@@ -2241,12 +3633,28 @@
           <w:lang w:val="nb-NO"/>
         </w:rPr>
         <w:lastRenderedPageBreak/>
-        <w:t>Kami sebagai Penerima/Penanggung Jawab telah membaca, memahami, dan menerima semua ketentuan Perusahaan tersebut.</w:t>
+        <w:t>Pihak penerima tidak diperkenankan memindahtangankan, meminjamkan, menjual, mengubah konfigurasi, atau menggunakan barang/peralatan di luar kepentingan pekerjaan tanpa persetujuan</w:t>
+      </w:r>
+      <w:r>
+        <w:rPr>
+          <w:sz w:val="18"/>
+          <w:szCs w:val="18"/>
+          <w:lang w:val="nb-NO"/>
+        </w:rPr>
+        <w:t xml:space="preserve"> </w:t>
+      </w:r>
+      <w:r>
+        <w:rPr>
+          <w:sz w:val="18"/>
+          <w:szCs w:val="18"/>
+          <w:lang w:val="nb-NO"/>
+        </w:rPr>
+        <w:t>Perusahaan atau fungsi yang berwenang.</w:t>
       </w:r>
     </w:p>
     <w:p>
       <w:pPr>
-        <w:pStyle w:val="DaftarParagraf"/>
+        <w:pStyle w:val="ListParagraph"/>
         <w:spacing w:after="120" w:line="276" w:lineRule="auto"/>
         <w:ind w:left="360"/>
         <w:jc w:val="both"/>
@@ -2259,7 +3667,106 @@
     </w:p>
     <w:p>
       <w:pPr>
-        <w:pStyle w:val="DaftarParagraf"/>
+        <w:pStyle w:val="ListParagraph"/>
+        <w:numPr>
+          <w:ilvl w:val="0"/>
+          <w:numId w:val="1"/>
+        </w:numPr>
+        <w:spacing w:after="120" w:line="276" w:lineRule="auto"/>
+        <w:ind w:left="360" w:hanging="180"/>
+        <w:jc w:val="both"/>
+        <w:rPr>
+          <w:bCs/>
+          <w:sz w:val="18"/>
+          <w:szCs w:val="18"/>
+          <w:lang w:val="nb-NO"/>
+        </w:rPr>
+      </w:pPr>
+      <w:r>
+        <w:rPr>
+          <w:bCs/>
+          <w:sz w:val="18"/>
+          <w:szCs w:val="18"/>
+          <w:lang w:val="nb-NO"/>
+        </w:rPr>
+        <w:t xml:space="preserve">Kami sebagai </w:t>
+      </w:r>
+      <w:r>
+        <w:rPr>
+          <w:bCs/>
+          <w:sz w:val="18"/>
+          <w:szCs w:val="18"/>
+          <w:lang w:val="nb-NO"/>
+        </w:rPr>
+        <w:t>p</w:t>
+      </w:r>
+      <w:r>
+        <w:rPr>
+          <w:bCs/>
+          <w:sz w:val="18"/>
+          <w:szCs w:val="18"/>
+          <w:lang w:val="nb-NO"/>
+        </w:rPr>
+        <w:t>enerima/</w:t>
+      </w:r>
+      <w:r>
+        <w:rPr>
+          <w:bCs/>
+          <w:sz w:val="18"/>
+          <w:szCs w:val="18"/>
+          <w:lang w:val="nb-NO"/>
+        </w:rPr>
+        <w:t>p</w:t>
+      </w:r>
+      <w:r>
+        <w:rPr>
+          <w:bCs/>
+          <w:sz w:val="18"/>
+          <w:szCs w:val="18"/>
+          <w:lang w:val="nb-NO"/>
+        </w:rPr>
+        <w:t xml:space="preserve">enanggung </w:t>
+      </w:r>
+      <w:r>
+        <w:rPr>
+          <w:bCs/>
+          <w:sz w:val="18"/>
+          <w:szCs w:val="18"/>
+          <w:lang w:val="nb-NO"/>
+        </w:rPr>
+        <w:t>j</w:t>
+      </w:r>
+      <w:r>
+        <w:rPr>
+          <w:bCs/>
+          <w:sz w:val="18"/>
+          <w:szCs w:val="18"/>
+          <w:lang w:val="nb-NO"/>
+        </w:rPr>
+        <w:t>awab telah membaca, memahami, dan menerima semua ketentuan Perusahaa</w:t>
+      </w:r>
+      <w:r>
+        <w:rPr>
+          <w:bCs/>
+          <w:sz w:val="18"/>
+          <w:szCs w:val="18"/>
+          <w:lang w:val="nb-NO"/>
+        </w:rPr>
+        <w:t>n</w:t>
+      </w:r>
+      <w:r>
+        <w:rPr>
+          <w:bCs/>
+          <w:sz w:val="18"/>
+          <w:szCs w:val="18"/>
+          <w:lang w:val="nb-NO"/>
+        </w:rPr>
+        <w:t>.</w:t>
+      </w:r>
+    </w:p>
+    <w:p>
+      <w:pPr>
+        <w:pStyle w:val="ListParagraph"/>
         <w:spacing w:after="120" w:line="276" w:lineRule="auto"/>
         <w:ind w:left="360"/>
         <w:jc w:val="both"/>
@@ -2272,7 +3779,46 @@
     </w:p>
     <w:p>
       <w:pPr>
-        <w:pStyle w:val="DaftarParagraf"/>
+        <w:pStyle w:val="ListParagraph"/>
+        <w:spacing w:after="120" w:line="276" w:lineRule="auto"/>
+        <w:ind w:left="360"/>
+        <w:jc w:val="both"/>
+        <w:rPr>
+          <w:sz w:val="18"/>
+          <w:szCs w:val="18"/>
+          <w:lang w:val="nb-NO"/>
+        </w:rPr>
+      </w:pPr>
+    </w:p>
+    <w:p>
+      <w:pPr>
+        <w:pStyle w:val="ListParagraph"/>
+        <w:spacing w:after="120" w:line="276" w:lineRule="auto"/>
+        <w:ind w:left="360"/>
+        <w:jc w:val="both"/>
+        <w:rPr>
+          <w:sz w:val="18"/>
+          <w:szCs w:val="18"/>
+          <w:lang w:val="nb-NO"/>
+        </w:rPr>
+      </w:pPr>
+    </w:p>
+    <w:p>
+      <w:pPr>
+        <w:pStyle w:val="ListParagraph"/>
+        <w:spacing w:after="120" w:line="276" w:lineRule="auto"/>
+        <w:ind w:left="360"/>
+        <w:jc w:val="both"/>
+        <w:rPr>
+          <w:sz w:val="18"/>
+          <w:szCs w:val="18"/>
+          <w:lang w:val="nb-NO"/>
+        </w:rPr>
+      </w:pPr>
+    </w:p>
+    <w:p>
+      <w:pPr>
+        <w:pStyle w:val="ListParagraph"/>
         <w:spacing w:after="120" w:line="276" w:lineRule="auto"/>
         <w:ind w:left="360"/>
         <w:jc w:val="both"/>
@@ -2285,7 +3831,7 @@
     </w:p>
     <w:tbl>
       <w:tblPr>
-        <w:tblStyle w:val="KisiTabel"/>
+        <w:tblStyle w:val="TableGrid"/>
         <w:tblW w:w="0" w:type="auto"/>
         <w:tblInd w:w="360" w:type="dxa"/>
         <w:tblLook w:val="04A0" w:firstRow="1" w:lastRow="0" w:firstColumn="1" w:lastColumn="0" w:noHBand="0" w:noVBand="1"/>
@@ -2302,7 +3848,7 @@
           </w:tcPr>
           <w:p>
             <w:pPr>
-              <w:pStyle w:val="DaftarParagraf"/>
+              <w:pStyle w:val="ListParagraph"/>
               <w:ind w:left="0"/>
               <w:rPr>
                 <w:noProof/>
@@ -2328,7 +3874,7 @@
           </w:tcPr>
           <w:p>
             <w:pPr>
-              <w:pStyle w:val="DaftarParagraf"/>
+              <w:pStyle w:val="ListParagraph"/>
               <w:ind w:left="0"/>
               <w:rPr>
                 <w:noProof/>
@@ -2349,7 +3895,7 @@
           </w:p>
           <w:p>
             <w:pPr>
-              <w:pStyle w:val="DaftarParagraf"/>
+              <w:pStyle w:val="ListParagraph"/>
               <w:ind w:left="0"/>
               <w:rPr>
                 <w:noProof/>
@@ -2393,7 +3939,7 @@
           </w:tcPr>
           <w:p>
             <w:pPr>
-              <w:pStyle w:val="DaftarParagraf"/>
+              <w:pStyle w:val="ListParagraph"/>
               <w:ind w:left="0"/>
               <w:rPr>
                 <w:noProof/>
@@ -2414,7 +3960,7 @@
           </w:p>
           <w:p>
             <w:pPr>
-              <w:pStyle w:val="DaftarParagraf"/>
+              <w:pStyle w:val="ListParagraph"/>
               <w:ind w:left="0"/>
               <w:rPr>
                 <w:noProof/>
@@ -2435,7 +3981,7 @@
           </w:p>
           <w:p>
             <w:pPr>
-              <w:pStyle w:val="DaftarParagraf"/>
+              <w:pStyle w:val="ListParagraph"/>
               <w:ind w:left="0"/>
               <w:rPr>
                 <w:noProof/>
@@ -2454,7 +4000,7 @@
           </w:tcPr>
           <w:p>
             <w:pPr>
-              <w:pStyle w:val="DaftarParagraf"/>
+              <w:pStyle w:val="ListParagraph"/>
               <w:ind w:left="0"/>
               <w:rPr>
                 <w:sz w:val="18"/>
@@ -2469,7 +4015,7 @@
           </w:p>
           <w:p>
             <w:pPr>
-              <w:pStyle w:val="DaftarParagraf"/>
+              <w:pStyle w:val="ListParagraph"/>
               <w:ind w:left="0"/>
               <w:rPr>
                 <w:b/>
@@ -2498,7 +4044,7 @@
           </w:tcPr>
           <w:p>
             <w:pPr>
-              <w:pStyle w:val="DaftarParagraf"/>
+              <w:pStyle w:val="ListParagraph"/>
               <w:ind w:left="0"/>
               <w:rPr>
                 <w:sz w:val="18"/>
@@ -2519,7 +4065,7 @@
           </w:p>
           <w:p>
             <w:pPr>
-              <w:pStyle w:val="DaftarParagraf"/>
+              <w:pStyle w:val="ListParagraph"/>
               <w:ind w:left="0"/>
               <w:rPr>
                 <w:b/>
@@ -2566,7 +4112,7 @@
           </w:tcPr>
           <w:p>
             <w:pPr>
-              <w:pStyle w:val="DaftarParagraf"/>
+              <w:pStyle w:val="ListParagraph"/>
               <w:ind w:left="0"/>
             </w:pPr>
             <w:r>
@@ -2575,7 +4121,7 @@
           </w:p>
           <w:p>
             <w:pPr>
-              <w:pStyle w:val="DaftarParagraf"/>
+              <w:pStyle w:val="ListParagraph"/>
               <w:ind w:left="0"/>
               <w:rPr>
                 <w:b/>
@@ -2680,6 +4226,227 @@
 <file path=word/numbering.xml><?xml version="1.0" encoding="utf-8"?>
 <w:numbering xmlns:wpc="http://schemas.microsoft.com/office/word/2010/wordprocessingCanvas" xmlns:cx="http://schemas.microsoft.com/office/drawing/2014/chartex" xmlns:cx1="http://schemas.microsoft.com/office/drawing/2015/9/8/chartex" xmlns:cx2="http://schemas.microsoft.com/office/drawing/2015/10/21/chartex" xmlns:cx3="http://schemas.microsoft.com/office/drawing/2016/5/9/chartex" xmlns:cx4="http://schemas.microsoft.com/office/drawing/2016/5/10/chartex" xmlns:cx5="http://schemas.microsoft.com/office/drawing/2016/5/11/chartex" xmlns:cx6="http://schemas.microsoft.com/office/drawing/2016/5/12/chartex" xmlns:cx7="http://schemas.microsoft.com/office/drawing/2016/5/13/chartex" xmlns:cx8="http://schemas.microsoft.com/office/drawing/2016/5/14/chartex" xmlns:mc="http://schemas.openxmlformats.org/markup-compatibility/2006" xmlns:aink="http://schemas.microsoft.com/office/drawing/2016/ink" xmlns:am3d="http://schemas.microsoft.com/office/drawing/2017/model3d" xmlns:o="urn:schemas-microsoft-com:office:office" xmlns:oel="http://schemas.microsoft.com/office/2019/extlst" xmlns:r="http://schemas.openxmlformats.org/officeDocument/2006/relationships" xmlns:m="http://schemas.openxmlformats.org/officeDocument/2006/math" xmlns:v="urn:schemas-microsoft-com:vml" xmlns:wp14="http://schemas.microsoft.com/office/word/2010/wordprocessingDrawing" xmlns:wp="http://schemas.openxmlformats.org/drawingml/2006/wordprocessingDrawing" xmlns:w10="urn:schemas-microsoft-com:office:word" xmlns:w="http://schemas.openxmlformats.org/wordprocessingml/2006/main" xmlns:w14="http://schemas.microsoft.com/office/word/2010/wordml" xmlns:w15="http://schemas.microsoft.com/office/word/2012/wordml" xmlns:w16cex="http://schemas.microsoft.com/office/word/2018/wordml/cex" xmlns:w16cid="http://schemas.microsoft.com/office/word/2016/wordml/cid" xmlns:w16="http://schemas.microsoft.com/office/word/2018/wordml" xmlns:w16du="http://schemas.microsoft.com/office/word/2023/wordml/word16du" xmlns:w16sdtdh="http://schemas.microsoft.com/office/word/2020/wordml/sdtdatahash" xmlns:w16sdtfl="http://schemas.microsoft.com/office/word/2024/wordml/sdtformatlock" xmlns:w16se="http://schemas.microsoft.com/office/word/2015/wordml/symex" xmlns:wpg="http://schemas.microsoft.com/office/word/2010/wordprocessingGroup" xmlns:wpi="http://schemas.microsoft.com/office/word/2010/wordprocessingInk" xmlns:wne="http://schemas.microsoft.com/office/word/2006/wordml" xmlns:wps="http://schemas.microsoft.com/office/word/2010/wordprocessingShape" mc:Ignorable="w14 w15 w16se w16cid w16 w16cex w16sdtdh w16sdtfl w16du wp14">
   <w:abstractNum w:abstractNumId="0" w15:restartNumberingAfterBreak="0">
+    <w:nsid w:val="07B846C9"/>
+    <w:multiLevelType w:val="hybridMultilevel"/>
+    <w:tmpl w:val="7B5038A4"/>
+    <w:lvl w:ilvl="0" w:tplc="7390BFB8">
+      <w:start w:val="1"/>
+      <w:numFmt w:val="upperRoman"/>
+      <w:lvlText w:val="%1."/>
+      <w:lvlJc w:val="left"/>
+      <w:pPr>
+        <w:ind w:left="814"/>
+      </w:pPr>
+      <w:rPr>
+        <w:rFonts w:ascii="Arial" w:eastAsia="Arial" w:hAnsi="Arial" w:cs="Arial"/>
+        <w:b/>
+        <w:bCs/>
+        <w:i w:val="0"/>
+        <w:strike w:val="0"/>
+        <w:dstrike w:val="0"/>
+        <w:color w:val="000000"/>
+        <w:sz w:val="20"/>
+        <w:szCs w:val="20"/>
+        <w:u w:val="none" w:color="000000"/>
+        <w:bdr w:val="none" w:sz="0" w:space="0" w:color="auto"/>
+        <w:shd w:val="clear" w:color="auto" w:fill="auto"/>
+        <w:vertAlign w:val="baseline"/>
+      </w:rPr>
+    </w:lvl>
+    <w:lvl w:ilvl="1" w:tplc="987075EC">
+      <w:start w:val="1"/>
+      <w:numFmt w:val="lowerLetter"/>
+      <w:lvlText w:val="%2"/>
+      <w:lvlJc w:val="left"/>
+      <w:pPr>
+        <w:ind w:left="1416"/>
+      </w:pPr>
+      <w:rPr>
+        <w:rFonts w:ascii="Arial" w:eastAsia="Arial" w:hAnsi="Arial" w:cs="Arial"/>
+        <w:b/>
+        <w:bCs/>
+        <w:i w:val="0"/>
+        <w:strike w:val="0"/>
+        <w:dstrike w:val="0"/>
+        <w:color w:val="000000"/>
+        <w:sz w:val="20"/>
+        <w:szCs w:val="20"/>
+        <w:u w:val="none" w:color="000000"/>
+        <w:bdr w:val="none" w:sz="0" w:space="0" w:color="auto"/>
+        <w:shd w:val="clear" w:color="auto" w:fill="auto"/>
+        <w:vertAlign w:val="baseline"/>
+      </w:rPr>
+    </w:lvl>
+    <w:lvl w:ilvl="2" w:tplc="650E2008">
+      <w:start w:val="1"/>
+      <w:numFmt w:val="lowerRoman"/>
+      <w:lvlText w:val="%3"/>
+      <w:lvlJc w:val="left"/>
+      <w:pPr>
+        <w:ind w:left="2136"/>
+      </w:pPr>
+      <w:rPr>
+        <w:rFonts w:ascii="Arial" w:eastAsia="Arial" w:hAnsi="Arial" w:cs="Arial"/>
+        <w:b/>
+        <w:bCs/>
+        <w:i w:val="0"/>
+        <w:strike w:val="0"/>
+        <w:dstrike w:val="0"/>
+        <w:color w:val="000000"/>
+        <w:sz w:val="20"/>
+        <w:szCs w:val="20"/>
+        <w:u w:val="none" w:color="000000"/>
+        <w:bdr w:val="none" w:sz="0" w:space="0" w:color="auto"/>
+        <w:shd w:val="clear" w:color="auto" w:fill="auto"/>
+        <w:vertAlign w:val="baseline"/>
+      </w:rPr>
+    </w:lvl>
+    <w:lvl w:ilvl="3" w:tplc="4C40BB4C">
+      <w:start w:val="1"/>
+      <w:numFmt w:val="decimal"/>
+      <w:lvlText w:val="%4"/>
+      <w:lvlJc w:val="left"/>
+      <w:pPr>
+        <w:ind w:left="2856"/>
+      </w:pPr>
+      <w:rPr>
+        <w:rFonts w:ascii="Arial" w:eastAsia="Arial" w:hAnsi="Arial" w:cs="Arial"/>
+        <w:b/>
+        <w:bCs/>
+        <w:i w:val="0"/>
+        <w:strike w:val="0"/>
+        <w:dstrike w:val="0"/>
+        <w:color w:val="000000"/>
+        <w:sz w:val="20"/>
+        <w:szCs w:val="20"/>
+        <w:u w:val="none" w:color="000000"/>
+        <w:bdr w:val="none" w:sz="0" w:space="0" w:color="auto"/>
+        <w:shd w:val="clear" w:color="auto" w:fill="auto"/>
+        <w:vertAlign w:val="baseline"/>
+      </w:rPr>
+    </w:lvl>
+    <w:lvl w:ilvl="4" w:tplc="F266C106">
+      <w:start w:val="1"/>
+      <w:numFmt w:val="lowerLetter"/>
+      <w:lvlText w:val="%5"/>
+      <w:lvlJc w:val="left"/>
+      <w:pPr>
+        <w:ind w:left="3576"/>
+      </w:pPr>
+      <w:rPr>
+        <w:rFonts w:ascii="Arial" w:eastAsia="Arial" w:hAnsi="Arial" w:cs="Arial"/>
+        <w:b/>
+        <w:bCs/>
+        <w:i w:val="0"/>
+        <w:strike w:val="0"/>
+        <w:dstrike w:val="0"/>
+        <w:color w:val="000000"/>
+        <w:sz w:val="20"/>
+        <w:szCs w:val="20"/>
+        <w:u w:val="none" w:color="000000"/>
+        <w:bdr w:val="none" w:sz="0" w:space="0" w:color="auto"/>
+        <w:shd w:val="clear" w:color="auto" w:fill="auto"/>
+        <w:vertAlign w:val="baseline"/>
+      </w:rPr>
+    </w:lvl>
+    <w:lvl w:ilvl="5" w:tplc="A27E6CCA">
+      <w:start w:val="1"/>
+      <w:numFmt w:val="lowerRoman"/>
+      <w:lvlText w:val="%6"/>
+      <w:lvlJc w:val="left"/>
+      <w:pPr>
+        <w:ind w:left="4296"/>
+      </w:pPr>
+      <w:rPr>
+        <w:rFonts w:ascii="Arial" w:eastAsia="Arial" w:hAnsi="Arial" w:cs="Arial"/>
+        <w:b/>
+        <w:bCs/>
+        <w:i w:val="0"/>
+        <w:strike w:val="0"/>
+        <w:dstrike w:val="0"/>
+        <w:color w:val="000000"/>
+        <w:sz w:val="20"/>
+        <w:szCs w:val="20"/>
+        <w:u w:val="none" w:color="000000"/>
+        <w:bdr w:val="none" w:sz="0" w:space="0" w:color="auto"/>
+        <w:shd w:val="clear" w:color="auto" w:fill="auto"/>
+        <w:vertAlign w:val="baseline"/>
+      </w:rPr>
+    </w:lvl>
+    <w:lvl w:ilvl="6" w:tplc="20801AF0">
+      <w:start w:val="1"/>
+      <w:numFmt w:val="decimal"/>
+      <w:lvlText w:val="%7"/>
+      <w:lvlJc w:val="left"/>
+      <w:pPr>
+        <w:ind w:left="5016"/>
+      </w:pPr>
+      <w:rPr>
+        <w:rFonts w:ascii="Arial" w:eastAsia="Arial" w:hAnsi="Arial" w:cs="Arial"/>
+        <w:b/>
+        <w:bCs/>
+        <w:i w:val="0"/>
+        <w:strike w:val="0"/>
+        <w:dstrike w:val="0"/>
+        <w:color w:val="000000"/>
+        <w:sz w:val="20"/>
+        <w:szCs w:val="20"/>
+        <w:u w:val="none" w:color="000000"/>
+        <w:bdr w:val="none" w:sz="0" w:space="0" w:color="auto"/>
+        <w:shd w:val="clear" w:color="auto" w:fill="auto"/>
+        <w:vertAlign w:val="baseline"/>
+      </w:rPr>
+    </w:lvl>
+    <w:lvl w:ilvl="7" w:tplc="C80CF35C">
+      <w:start w:val="1"/>
+      <w:numFmt w:val="lowerLetter"/>
+      <w:lvlText w:val="%8"/>
+      <w:lvlJc w:val="left"/>
+      <w:pPr>
+        <w:ind w:left="5736"/>
+      </w:pPr>
+      <w:rPr>
+        <w:rFonts w:ascii="Arial" w:eastAsia="Arial" w:hAnsi="Arial" w:cs="Arial"/>
+        <w:b/>
+        <w:bCs/>
+        <w:i w:val="0"/>
+        <w:strike w:val="0"/>
+        <w:dstrike w:val="0"/>
+        <w:color w:val="000000"/>
+        <w:sz w:val="20"/>
+        <w:szCs w:val="20"/>
+        <w:u w:val="none" w:color="000000"/>
+        <w:bdr w:val="none" w:sz="0" w:space="0" w:color="auto"/>
+        <w:shd w:val="clear" w:color="auto" w:fill="auto"/>
+        <w:vertAlign w:val="baseline"/>
+      </w:rPr>
+    </w:lvl>
+    <w:lvl w:ilvl="8" w:tplc="B62A0FAE">
+      <w:start w:val="1"/>
+      <w:numFmt w:val="lowerRoman"/>
+      <w:lvlText w:val="%9"/>
+      <w:lvlJc w:val="left"/>
+      <w:pPr>
+        <w:ind w:left="6456"/>
+      </w:pPr>
+      <w:rPr>
+        <w:rFonts w:ascii="Arial" w:eastAsia="Arial" w:hAnsi="Arial" w:cs="Arial"/>
+        <w:b/>
+        <w:bCs/>
+        <w:i w:val="0"/>
+        <w:strike w:val="0"/>
+        <w:dstrike w:val="0"/>
+        <w:color w:val="000000"/>
+        <w:sz w:val="20"/>
+        <w:szCs w:val="20"/>
+        <w:u w:val="none" w:color="000000"/>
+        <w:bdr w:val="none" w:sz="0" w:space="0" w:color="auto"/>
+        <w:shd w:val="clear" w:color="auto" w:fill="auto"/>
+        <w:vertAlign w:val="baseline"/>
+      </w:rPr>
+    </w:lvl>
+  </w:abstractNum>
+  <w:abstractNum w:abstractNumId="1" w15:restartNumberingAfterBreak="0">
     <w:nsid w:val="23720D96"/>
     <w:multiLevelType w:val="hybridMultilevel"/>
     <w:tmpl w:val="AF82BDEC"/>
@@ -2766,6 +4533,9 @@
     </w:lvl>
   </w:abstractNum>
   <w:num w:numId="1" w16cid:durableId="222570238">
+    <w:abstractNumId w:val="1"/>
+  </w:num>
+  <w:num w:numId="2" w16cid:durableId="846092921">
     <w:abstractNumId w:val="0"/>
   </w:num>
 </w:numbering>
@@ -3183,11 +4953,11 @@
       <w14:ligatures w14:val="none"/>
     </w:rPr>
   </w:style>
-  <w:style w:type="paragraph" w:styleId="Judul1">
+  <w:style w:type="paragraph" w:styleId="Heading1">
     <w:name w:val="heading 1"/>
     <w:basedOn w:val="Normal"/>
     <w:next w:val="Normal"/>
-    <w:link w:val="Judul1KAR"/>
+    <w:link w:val="Heading1Char"/>
     <w:uiPriority w:val="9"/>
     <w:qFormat/>
     <w:rsid w:val="00610B46"/>
@@ -3204,11 +4974,11 @@
       <w:szCs w:val="40"/>
     </w:rPr>
   </w:style>
-  <w:style w:type="paragraph" w:styleId="Judul2">
+  <w:style w:type="paragraph" w:styleId="Heading2">
     <w:name w:val="heading 2"/>
     <w:basedOn w:val="Normal"/>
     <w:next w:val="Normal"/>
-    <w:link w:val="Judul2KAR"/>
+    <w:link w:val="Heading2Char"/>
     <w:uiPriority w:val="9"/>
     <w:semiHidden/>
     <w:unhideWhenUsed/>
@@ -3227,11 +4997,11 @@
       <w:szCs w:val="32"/>
     </w:rPr>
   </w:style>
-  <w:style w:type="paragraph" w:styleId="Judul3">
+  <w:style w:type="paragraph" w:styleId="Heading3">
     <w:name w:val="heading 3"/>
     <w:basedOn w:val="Normal"/>
     <w:next w:val="Normal"/>
-    <w:link w:val="Judul3KAR"/>
+    <w:link w:val="Heading3Char"/>
     <w:uiPriority w:val="9"/>
     <w:semiHidden/>
     <w:unhideWhenUsed/>
@@ -3250,11 +5020,11 @@
       <w:szCs w:val="28"/>
     </w:rPr>
   </w:style>
-  <w:style w:type="paragraph" w:styleId="Judul4">
+  <w:style w:type="paragraph" w:styleId="Heading4">
     <w:name w:val="heading 4"/>
     <w:basedOn w:val="Normal"/>
     <w:next w:val="Normal"/>
-    <w:link w:val="Judul4KAR"/>
+    <w:link w:val="Heading4Char"/>
     <w:uiPriority w:val="9"/>
     <w:semiHidden/>
     <w:unhideWhenUsed/>
@@ -3273,11 +5043,11 @@
       <w:color w:val="2F5496" w:themeColor="accent1" w:themeShade="BF"/>
     </w:rPr>
   </w:style>
-  <w:style w:type="paragraph" w:styleId="Judul5">
+  <w:style w:type="paragraph" w:styleId="Heading5">
     <w:name w:val="heading 5"/>
     <w:basedOn w:val="Normal"/>
     <w:next w:val="Normal"/>
-    <w:link w:val="Judul5KAR"/>
+    <w:link w:val="Heading5Char"/>
     <w:uiPriority w:val="9"/>
     <w:semiHidden/>
     <w:unhideWhenUsed/>
@@ -3294,11 +5064,11 @@
       <w:color w:val="2F5496" w:themeColor="accent1" w:themeShade="BF"/>
     </w:rPr>
   </w:style>
-  <w:style w:type="paragraph" w:styleId="Judul6">
+  <w:style w:type="paragraph" w:styleId="Heading6">
     <w:name w:val="heading 6"/>
     <w:basedOn w:val="Normal"/>
     <w:next w:val="Normal"/>
-    <w:link w:val="Judul6KAR"/>
+    <w:link w:val="Heading6Char"/>
     <w:uiPriority w:val="9"/>
     <w:semiHidden/>
     <w:unhideWhenUsed/>
@@ -3317,11 +5087,11 @@
       <w:color w:val="595959" w:themeColor="text1" w:themeTint="A6"/>
     </w:rPr>
   </w:style>
-  <w:style w:type="paragraph" w:styleId="Judul7">
+  <w:style w:type="paragraph" w:styleId="Heading7">
     <w:name w:val="heading 7"/>
     <w:basedOn w:val="Normal"/>
     <w:next w:val="Normal"/>
-    <w:link w:val="Judul7KAR"/>
+    <w:link w:val="Heading7Char"/>
     <w:uiPriority w:val="9"/>
     <w:semiHidden/>
     <w:unhideWhenUsed/>
@@ -3338,11 +5108,11 @@
       <w:color w:val="595959" w:themeColor="text1" w:themeTint="A6"/>
     </w:rPr>
   </w:style>
-  <w:style w:type="paragraph" w:styleId="Judul8">
+  <w:style w:type="paragraph" w:styleId="Heading8">
     <w:name w:val="heading 8"/>
     <w:basedOn w:val="Normal"/>
     <w:next w:val="Normal"/>
-    <w:link w:val="Judul8KAR"/>
+    <w:link w:val="Heading8Char"/>
     <w:uiPriority w:val="9"/>
     <w:semiHidden/>
     <w:unhideWhenUsed/>
@@ -3360,11 +5130,11 @@
       <w:color w:val="272727" w:themeColor="text1" w:themeTint="D8"/>
     </w:rPr>
   </w:style>
-  <w:style w:type="paragraph" w:styleId="Judul9">
+  <w:style w:type="paragraph" w:styleId="Heading9">
     <w:name w:val="heading 9"/>
     <w:basedOn w:val="Normal"/>
     <w:next w:val="Normal"/>
-    <w:link w:val="Judul9KAR"/>
+    <w:link w:val="Heading9Char"/>
     <w:uiPriority w:val="9"/>
     <w:semiHidden/>
     <w:unhideWhenUsed/>
@@ -3380,13 +5150,13 @@
       <w:color w:val="272727" w:themeColor="text1" w:themeTint="D8"/>
     </w:rPr>
   </w:style>
-  <w:style w:type="character" w:default="1" w:styleId="FontParagrafDefault">
+  <w:style w:type="character" w:default="1" w:styleId="DefaultParagraphFont">
     <w:name w:val="Default Paragraph Font"/>
     <w:uiPriority w:val="1"/>
     <w:semiHidden/>
     <w:unhideWhenUsed/>
   </w:style>
-  <w:style w:type="table" w:default="1" w:styleId="TabelNormal">
+  <w:style w:type="table" w:default="1" w:styleId="TableNormal">
     <w:name w:val="Normal Table"/>
     <w:uiPriority w:val="99"/>
     <w:semiHidden/>
@@ -3401,16 +5171,16 @@
       </w:tblCellMar>
     </w:tblPr>
   </w:style>
-  <w:style w:type="numbering" w:default="1" w:styleId="TidakAdaDaftar">
+  <w:style w:type="numbering" w:default="1" w:styleId="NoList">
     <w:name w:val="No List"/>
     <w:uiPriority w:val="99"/>
     <w:semiHidden/>
     <w:unhideWhenUsed/>
   </w:style>
-  <w:style w:type="character" w:customStyle="1" w:styleId="Judul1KAR">
-    <w:name w:val="Judul 1 KAR"/>
-    <w:basedOn w:val="FontParagrafDefault"/>
-    <w:link w:val="Judul1"/>
+  <w:style w:type="character" w:customStyle="1" w:styleId="Heading1Char">
+    <w:name w:val="Heading 1 Char"/>
+    <w:basedOn w:val="DefaultParagraphFont"/>
+    <w:link w:val="Heading1"/>
     <w:uiPriority w:val="9"/>
     <w:rsid w:val="00610B46"/>
     <w:rPr>
@@ -3420,10 +5190,10 @@
       <w:szCs w:val="40"/>
     </w:rPr>
   </w:style>
-  <w:style w:type="character" w:customStyle="1" w:styleId="Judul2KAR">
-    <w:name w:val="Judul 2 KAR"/>
-    <w:basedOn w:val="FontParagrafDefault"/>
-    <w:link w:val="Judul2"/>
+  <w:style w:type="character" w:customStyle="1" w:styleId="Heading2Char">
+    <w:name w:val="Heading 2 Char"/>
+    <w:basedOn w:val="DefaultParagraphFont"/>
+    <w:link w:val="Heading2"/>
     <w:uiPriority w:val="9"/>
     <w:semiHidden/>
     <w:rsid w:val="00610B46"/>
@@ -3434,10 +5204,10 @@
       <w:szCs w:val="32"/>
     </w:rPr>
   </w:style>
-  <w:style w:type="character" w:customStyle="1" w:styleId="Judul3KAR">
-    <w:name w:val="Judul 3 KAR"/>
-    <w:basedOn w:val="FontParagrafDefault"/>
-    <w:link w:val="Judul3"/>
+  <w:style w:type="character" w:customStyle="1" w:styleId="Heading3Char">
+    <w:name w:val="Heading 3 Char"/>
+    <w:basedOn w:val="DefaultParagraphFont"/>
+    <w:link w:val="Heading3"/>
     <w:uiPriority w:val="9"/>
     <w:semiHidden/>
     <w:rsid w:val="00610B46"/>
@@ -3448,10 +5218,10 @@
       <w:szCs w:val="28"/>
     </w:rPr>
   </w:style>
-  <w:style w:type="character" w:customStyle="1" w:styleId="Judul4KAR">
-    <w:name w:val="Judul 4 KAR"/>
-    <w:basedOn w:val="FontParagrafDefault"/>
-    <w:link w:val="Judul4"/>
+  <w:style w:type="character" w:customStyle="1" w:styleId="Heading4Char">
+    <w:name w:val="Heading 4 Char"/>
+    <w:basedOn w:val="DefaultParagraphFont"/>
+    <w:link w:val="Heading4"/>
     <w:uiPriority w:val="9"/>
     <w:semiHidden/>
     <w:rsid w:val="00610B46"/>
@@ -3462,10 +5232,10 @@
       <w:color w:val="2F5496" w:themeColor="accent1" w:themeShade="BF"/>
     </w:rPr>
   </w:style>
-  <w:style w:type="character" w:customStyle="1" w:styleId="Judul5KAR">
-    <w:name w:val="Judul 5 KAR"/>
-    <w:basedOn w:val="FontParagrafDefault"/>
-    <w:link w:val="Judul5"/>
+  <w:style w:type="character" w:customStyle="1" w:styleId="Heading5Char">
+    <w:name w:val="Heading 5 Char"/>
+    <w:basedOn w:val="DefaultParagraphFont"/>
+    <w:link w:val="Heading5"/>
     <w:uiPriority w:val="9"/>
     <w:semiHidden/>
     <w:rsid w:val="00610B46"/>
@@ -3474,10 +5244,10 @@
       <w:color w:val="2F5496" w:themeColor="accent1" w:themeShade="BF"/>
     </w:rPr>
   </w:style>
-  <w:style w:type="character" w:customStyle="1" w:styleId="Judul6KAR">
-    <w:name w:val="Judul 6 KAR"/>
-    <w:basedOn w:val="FontParagrafDefault"/>
-    <w:link w:val="Judul6"/>
+  <w:style w:type="character" w:customStyle="1" w:styleId="Heading6Char">
+    <w:name w:val="Heading 6 Char"/>
+    <w:basedOn w:val="DefaultParagraphFont"/>
+    <w:link w:val="Heading6"/>
     <w:uiPriority w:val="9"/>
     <w:semiHidden/>
     <w:rsid w:val="00610B46"/>
@@ -3488,10 +5258,10 @@
       <w:color w:val="595959" w:themeColor="text1" w:themeTint="A6"/>
     </w:rPr>
   </w:style>
-  <w:style w:type="character" w:customStyle="1" w:styleId="Judul7KAR">
-    <w:name w:val="Judul 7 KAR"/>
-    <w:basedOn w:val="FontParagrafDefault"/>
-    <w:link w:val="Judul7"/>
+  <w:style w:type="character" w:customStyle="1" w:styleId="Heading7Char">
+    <w:name w:val="Heading 7 Char"/>
+    <w:basedOn w:val="DefaultParagraphFont"/>
+    <w:link w:val="Heading7"/>
     <w:uiPriority w:val="9"/>
     <w:semiHidden/>
     <w:rsid w:val="00610B46"/>
@@ -3500,10 +5270,10 @@
       <w:color w:val="595959" w:themeColor="text1" w:themeTint="A6"/>
     </w:rPr>
   </w:style>
-  <w:style w:type="character" w:customStyle="1" w:styleId="Judul8KAR">
-    <w:name w:val="Judul 8 KAR"/>
-    <w:basedOn w:val="FontParagrafDefault"/>
-    <w:link w:val="Judul8"/>
+  <w:style w:type="character" w:customStyle="1" w:styleId="Heading8Char">
+    <w:name w:val="Heading 8 Char"/>
+    <w:basedOn w:val="DefaultParagraphFont"/>
+    <w:link w:val="Heading8"/>
     <w:uiPriority w:val="9"/>
     <w:semiHidden/>
     <w:rsid w:val="00610B46"/>
@@ -3514,10 +5284,10 @@
       <w:color w:val="272727" w:themeColor="text1" w:themeTint="D8"/>
     </w:rPr>
   </w:style>
-  <w:style w:type="character" w:customStyle="1" w:styleId="Judul9KAR">
-    <w:name w:val="Judul 9 KAR"/>
-    <w:basedOn w:val="FontParagrafDefault"/>
-    <w:link w:val="Judul9"/>
+  <w:style w:type="character" w:customStyle="1" w:styleId="Heading9Char">
+    <w:name w:val="Heading 9 Char"/>
+    <w:basedOn w:val="DefaultParagraphFont"/>
+    <w:link w:val="Heading9"/>
     <w:uiPriority w:val="9"/>
     <w:semiHidden/>
     <w:rsid w:val="00610B46"/>
@@ -3526,11 +5296,11 @@
       <w:color w:val="272727" w:themeColor="text1" w:themeTint="D8"/>
     </w:rPr>
   </w:style>
-  <w:style w:type="paragraph" w:styleId="Judul">
+  <w:style w:type="paragraph" w:styleId="Title">
     <w:name w:val="Title"/>
     <w:basedOn w:val="Normal"/>
     <w:next w:val="Normal"/>
-    <w:link w:val="JudulKAR"/>
+    <w:link w:val="TitleChar"/>
     <w:uiPriority w:val="10"/>
     <w:qFormat/>
     <w:rsid w:val="00610B46"/>
@@ -3546,10 +5316,10 @@
       <w:szCs w:val="56"/>
     </w:rPr>
   </w:style>
-  <w:style w:type="character" w:customStyle="1" w:styleId="JudulKAR">
-    <w:name w:val="Judul KAR"/>
-    <w:basedOn w:val="FontParagrafDefault"/>
-    <w:link w:val="Judul"/>
+  <w:style w:type="character" w:customStyle="1" w:styleId="TitleChar">
+    <w:name w:val="Title Char"/>
+    <w:basedOn w:val="DefaultParagraphFont"/>
+    <w:link w:val="Title"/>
     <w:uiPriority w:val="10"/>
     <w:rsid w:val="00610B46"/>
     <w:rPr>
@@ -3560,11 +5330,11 @@
       <w:szCs w:val="56"/>
     </w:rPr>
   </w:style>
-  <w:style w:type="paragraph" w:styleId="Subjudul">
+  <w:style w:type="paragraph" w:styleId="Subtitle">
     <w:name w:val="Subtitle"/>
     <w:basedOn w:val="Normal"/>
     <w:next w:val="Normal"/>
-    <w:link w:val="SubjudulKAR"/>
+    <w:link w:val="SubtitleChar"/>
     <w:uiPriority w:val="11"/>
     <w:qFormat/>
     <w:rsid w:val="00610B46"/>
@@ -3581,10 +5351,10 @@
       <w:szCs w:val="28"/>
     </w:rPr>
   </w:style>
-  <w:style w:type="character" w:customStyle="1" w:styleId="SubjudulKAR">
-    <w:name w:val="Subjudul KAR"/>
-    <w:basedOn w:val="FontParagrafDefault"/>
-    <w:link w:val="Subjudul"/>
+  <w:style w:type="character" w:customStyle="1" w:styleId="SubtitleChar">
+    <w:name w:val="Subtitle Char"/>
+    <w:basedOn w:val="DefaultParagraphFont"/>
+    <w:link w:val="Subtitle"/>
     <w:uiPriority w:val="11"/>
     <w:rsid w:val="00610B46"/>
     <w:rPr>
@@ -3595,11 +5365,11 @@
       <w:szCs w:val="28"/>
     </w:rPr>
   </w:style>
-  <w:style w:type="paragraph" w:styleId="Kutipan">
+  <w:style w:type="paragraph" w:styleId="Quote">
     <w:name w:val="Quote"/>
     <w:basedOn w:val="Normal"/>
     <w:next w:val="Normal"/>
-    <w:link w:val="KutipanKAR"/>
+    <w:link w:val="QuoteChar"/>
     <w:uiPriority w:val="29"/>
     <w:qFormat/>
     <w:rsid w:val="00610B46"/>
@@ -3613,10 +5383,10 @@
       <w:color w:val="404040" w:themeColor="text1" w:themeTint="BF"/>
     </w:rPr>
   </w:style>
-  <w:style w:type="character" w:customStyle="1" w:styleId="KutipanKAR">
-    <w:name w:val="Kutipan KAR"/>
-    <w:basedOn w:val="FontParagrafDefault"/>
-    <w:link w:val="Kutipan"/>
+  <w:style w:type="character" w:customStyle="1" w:styleId="QuoteChar">
+    <w:name w:val="Quote Char"/>
+    <w:basedOn w:val="DefaultParagraphFont"/>
+    <w:link w:val="Quote"/>
     <w:uiPriority w:val="29"/>
     <w:rsid w:val="00610B46"/>
     <w:rPr>
@@ -3625,7 +5395,7 @@
       <w:color w:val="404040" w:themeColor="text1" w:themeTint="BF"/>
     </w:rPr>
   </w:style>
-  <w:style w:type="paragraph" w:styleId="DaftarParagraf">
+  <w:style w:type="paragraph" w:styleId="ListParagraph">
     <w:name w:val="List Paragraph"/>
     <w:basedOn w:val="Normal"/>
     <w:uiPriority w:val="34"/>
@@ -3636,9 +5406,9 @@
       <w:contextualSpacing/>
     </w:pPr>
   </w:style>
-  <w:style w:type="character" w:styleId="PenekananKeras">
+  <w:style w:type="character" w:styleId="IntenseEmphasis">
     <w:name w:val="Intense Emphasis"/>
-    <w:basedOn w:val="FontParagrafDefault"/>
+    <w:basedOn w:val="DefaultParagraphFont"/>
     <w:uiPriority w:val="21"/>
     <w:qFormat/>
     <w:rsid w:val="00610B46"/>
@@ -3648,11 +5418,11 @@
       <w:color w:val="2F5496" w:themeColor="accent1" w:themeShade="BF"/>
     </w:rPr>
   </w:style>
-  <w:style w:type="paragraph" w:styleId="KutipanyangSering">
+  <w:style w:type="paragraph" w:styleId="IntenseQuote">
     <w:name w:val="Intense Quote"/>
     <w:basedOn w:val="Normal"/>
     <w:next w:val="Normal"/>
-    <w:link w:val="KutipanyangSeringKAR"/>
+    <w:link w:val="IntenseQuoteChar"/>
     <w:uiPriority w:val="30"/>
     <w:qFormat/>
     <w:rsid w:val="00610B46"/>
@@ -3671,10 +5441,10 @@
       <w:color w:val="2F5496" w:themeColor="accent1" w:themeShade="BF"/>
     </w:rPr>
   </w:style>
-  <w:style w:type="character" w:customStyle="1" w:styleId="KutipanyangSeringKAR">
-    <w:name w:val="Kutipan yang Sering KAR"/>
-    <w:basedOn w:val="FontParagrafDefault"/>
-    <w:link w:val="KutipanyangSering"/>
+  <w:style w:type="character" w:customStyle="1" w:styleId="IntenseQuoteChar">
+    <w:name w:val="Intense Quote Char"/>
+    <w:basedOn w:val="DefaultParagraphFont"/>
+    <w:link w:val="IntenseQuote"/>
     <w:uiPriority w:val="30"/>
     <w:rsid w:val="00610B46"/>
     <w:rPr>
@@ -3683,9 +5453,9 @@
       <w:color w:val="2F5496" w:themeColor="accent1" w:themeShade="BF"/>
     </w:rPr>
   </w:style>
-  <w:style w:type="character" w:styleId="ReferensiyangSering">
+  <w:style w:type="character" w:styleId="IntenseReference">
     <w:name w:val="Intense Reference"/>
-    <w:basedOn w:val="FontParagrafDefault"/>
+    <w:basedOn w:val="DefaultParagraphFont"/>
     <w:uiPriority w:val="32"/>
     <w:qFormat/>
     <w:rsid w:val="00610B46"/>
@@ -3697,9 +5467,9 @@
       <w:spacing w:val="5"/>
     </w:rPr>
   </w:style>
-  <w:style w:type="table" w:styleId="KisiTabel">
+  <w:style w:type="table" w:styleId="TableGrid">
     <w:name w:val="Table Grid"/>
-    <w:basedOn w:val="TabelNormal"/>
+    <w:basedOn w:val="TableNormal"/>
     <w:uiPriority w:val="39"/>
     <w:rsid w:val="00610B46"/>
     <w:pPr>

</xml_diff>